<commit_message>
feat(docs): step 17 — PNR program rewrite (программа ПНР)
- 6 фаз: подготовка | осмотр | измерения | наладка | испытания | документация
- Колонка Исполнитель: ПНР-организация / Генподрядчик / Заказчик
- Нормативы: СНиП 3.05.06-85, ПУЭ, ПТЭЭП, ГОСТ Р 50345, РД 34.20.501
- Авто-этапы для АВР (has_avr): наладка + проверка под нагрузкой
- Авто-этапы для FRLS/кат.1: проверка огнестойкости линий
- Авто-этапы для outdoor_networks: испытание наружного освещения
- Динамический расчёт дней (_days): зависит от объёма измерений
- Итоговая строка: кол. этапов + суммарные рабочие дни
- Штамп (Разработал/Проверил/Н.контроль/ГИП)
- TXT fallback без python-docx

https://claude.ai/code/session_01EUXh9NoaZ7HpixNuaMKahR
</commit_message>
<xml_diff>
--- a/elec-system/projects/DEMO-2025-001_Офисный_центр/docs/DEMO-2025-001_pnr.docx
+++ b/elec-system/projects/DEMO-2025-001_Офисный_центр/docs/DEMO-2025-001_pnr.docx
@@ -12,7 +12,7 @@
           <w:b/>
           <w:sz w:val="26"/>
         </w:rPr>
-        <w:t>Программа пусконаладочных работ (ПНР)</w:t>
+        <w:t>ПРОГРАММА ПУСКОНАЛАДОЧНЫХ РАБОТ</w:t>
       </w:r>
     </w:p>
     <w:p>
@@ -22,9 +22,23 @@
       <w:r>
         <w:rPr>
           <w:rFonts w:ascii="Times New Roman" w:hAnsi="Times New Roman"/>
+          <w:b w:val="0"/>
+          <w:sz w:val="22"/>
+        </w:rPr>
+        <w:t>Офисный центр</w:t>
+      </w:r>
+    </w:p>
+    <w:p>
+      <w:pPr>
+        <w:jc w:val="center"/>
+      </w:pPr>
+      <w:r>
+        <w:rPr>
+          <w:rFonts w:ascii="Times New Roman" w:hAnsi="Times New Roman"/>
+          <w:b w:val="0"/>
           <w:sz w:val="20"/>
         </w:rPr>
-        <w:t>Электроснабжение офисный центр | Код: DEMO-2025-001 | Стадия: Р | Ред.: 0 | Дата: 2025-04-18</w:t>
+        <w:t>Код: DEMO-2025-001  |  Стадия: Р  |  Ред.: 0  |  Дата: 2025-04-18</w:t>
       </w:r>
     </w:p>
     <w:p/>
@@ -32,20 +46,22 @@
       <w:tblPr>
         <w:tblStyle w:val="TableGrid"/>
         <w:tblW w:type="auto" w:w="0"/>
+        <w:jc w:val="center"/>
         <w:tblLook w:firstColumn="1" w:firstRow="1" w:lastColumn="0" w:lastRow="0" w:noHBand="0" w:noVBand="1" w:val="04A0"/>
       </w:tblPr>
       <w:tblGrid>
-        <w:gridCol w:w="2523"/>
-        <w:gridCol w:w="2523"/>
-        <w:gridCol w:w="2523"/>
-        <w:gridCol w:w="2523"/>
-        <w:gridCol w:w="2523"/>
-        <w:gridCol w:w="2523"/>
+        <w:gridCol w:w="2162"/>
+        <w:gridCol w:w="2162"/>
+        <w:gridCol w:w="2162"/>
+        <w:gridCol w:w="2162"/>
+        <w:gridCol w:w="2162"/>
+        <w:gridCol w:w="2162"/>
+        <w:gridCol w:w="2162"/>
       </w:tblGrid>
       <w:tr>
         <w:tc>
           <w:tcPr>
-            <w:tcW w:type="dxa" w:w="567"/>
+            <w:tcW w:type="dxa" w:w="454"/>
             <w:vAlign w:val="center"/>
           </w:tcPr>
           <w:p>
@@ -64,7 +80,7 @@
         </w:tc>
         <w:tc>
           <w:tcPr>
-            <w:tcW w:type="dxa" w:w="5669"/>
+            <w:tcW w:type="dxa" w:w="5386"/>
             <w:vAlign w:val="center"/>
           </w:tcPr>
           <w:p>
@@ -83,7 +99,7 @@
         </w:tc>
         <w:tc>
           <w:tcPr>
-            <w:tcW w:type="dxa" w:w="1984"/>
+            <w:tcW w:type="dxa" w:w="2154"/>
             <w:vAlign w:val="center"/>
           </w:tcPr>
           <w:p>
@@ -102,7 +118,7 @@
         </w:tc>
         <w:tc>
           <w:tcPr>
-            <w:tcW w:type="dxa" w:w="1020"/>
+            <w:tcW w:type="dxa" w:w="850"/>
             <w:vAlign w:val="center"/>
           </w:tcPr>
           <w:p>
@@ -121,7 +137,7 @@
         </w:tc>
         <w:tc>
           <w:tcPr>
-            <w:tcW w:type="dxa" w:w="1020"/>
+            <w:tcW w:type="dxa" w:w="850"/>
             <w:vAlign w:val="center"/>
           </w:tcPr>
           <w:p>
@@ -140,7 +156,26 @@
         </w:tc>
         <w:tc>
           <w:tcPr>
-            <w:tcW w:type="dxa" w:w="1417"/>
+            <w:tcW w:type="dxa" w:w="2268"/>
+            <w:vAlign w:val="center"/>
+          </w:tcPr>
+          <w:p>
+            <w:pPr>
+              <w:jc w:val="center"/>
+            </w:pPr>
+            <w:r>
+              <w:rPr>
+                <w:rFonts w:ascii="Times New Roman" w:hAnsi="Times New Roman"/>
+                <w:b/>
+                <w:sz w:val="20"/>
+              </w:rPr>
+              <w:t>Исполнитель</w:t>
+            </w:r>
+          </w:p>
+        </w:tc>
+        <w:tc>
+          <w:tcPr>
+            <w:tcW w:type="dxa" w:w="1020"/>
             <w:vAlign w:val="center"/>
           </w:tcPr>
           <w:p>
@@ -161,7 +196,28 @@
       <w:tr>
         <w:tc>
           <w:tcPr>
-            <w:tcW w:type="dxa" w:w="567"/>
+            <w:tcW w:type="dxa" w:w="15134"/>
+            <w:gridSpan w:val="7"/>
+          </w:tcPr>
+          <w:p>
+            <w:pPr>
+              <w:jc w:val="left"/>
+            </w:pPr>
+            <w:r>
+              <w:rPr>
+                <w:rFonts w:ascii="Times New Roman" w:hAnsi="Times New Roman"/>
+                <w:b/>
+                <w:sz w:val="20"/>
+              </w:rPr>
+              <w:t xml:space="preserve">  1. Подготовительные работы</w:t>
+            </w:r>
+          </w:p>
+        </w:tc>
+      </w:tr>
+      <w:tr>
+        <w:tc>
+          <w:tcPr>
+            <w:tcW w:type="dxa" w:w="454"/>
           </w:tcPr>
           <w:p>
             <w:pPr>
@@ -170,6 +226,7 @@
             <w:r>
               <w:rPr>
                 <w:rFonts w:ascii="Times New Roman" w:hAnsi="Times New Roman"/>
+                <w:b w:val="0"/>
                 <w:sz w:val="20"/>
               </w:rPr>
               <w:t>1</w:t>
@@ -178,7 +235,7 @@
         </w:tc>
         <w:tc>
           <w:tcPr>
-            <w:tcW w:type="dxa" w:w="5669"/>
+            <w:tcW w:type="dxa" w:w="5386"/>
           </w:tcPr>
           <w:p>
             <w:pPr>
@@ -187,15 +244,16 @@
             <w:r>
               <w:rPr>
                 <w:rFonts w:ascii="Times New Roman" w:hAnsi="Times New Roman"/>
+                <w:b w:val="0"/>
                 <w:sz w:val="20"/>
               </w:rPr>
-              <w:t>Визуальный осмотр электрооборудования и кабельных линий</w:t>
+              <w:t>Изучение проектной документации и ТУ</w:t>
             </w:r>
           </w:p>
         </w:tc>
         <w:tc>
           <w:tcPr>
-            <w:tcW w:type="dxa" w:w="1984"/>
+            <w:tcW w:type="dxa" w:w="2154"/>
           </w:tcPr>
           <w:p>
             <w:pPr>
@@ -204,9 +262,64 @@
             <w:r>
               <w:rPr>
                 <w:rFonts w:ascii="Times New Roman" w:hAnsi="Times New Roman"/>
+                <w:b w:val="0"/>
                 <w:sz w:val="20"/>
               </w:rPr>
-              <w:t>ПУЭ гл.1.8</w:t>
+              <w:t>СНиП 3.05.06-85 п.4.1</w:t>
+            </w:r>
+          </w:p>
+        </w:tc>
+        <w:tc>
+          <w:tcPr>
+            <w:tcW w:type="dxa" w:w="850"/>
+          </w:tcPr>
+          <w:p>
+            <w:pPr>
+              <w:jc w:val="center"/>
+            </w:pPr>
+            <w:r>
+              <w:rPr>
+                <w:rFonts w:ascii="Times New Roman" w:hAnsi="Times New Roman"/>
+                <w:b w:val="0"/>
+                <w:sz w:val="20"/>
+              </w:rPr>
+              <w:t>компл.</w:t>
+            </w:r>
+          </w:p>
+        </w:tc>
+        <w:tc>
+          <w:tcPr>
+            <w:tcW w:type="dxa" w:w="850"/>
+          </w:tcPr>
+          <w:p>
+            <w:pPr>
+              <w:jc w:val="center"/>
+            </w:pPr>
+            <w:r>
+              <w:rPr>
+                <w:rFonts w:ascii="Times New Roman" w:hAnsi="Times New Roman"/>
+                <w:b w:val="0"/>
+                <w:sz w:val="20"/>
+              </w:rPr>
+              <w:t>1</w:t>
+            </w:r>
+          </w:p>
+        </w:tc>
+        <w:tc>
+          <w:tcPr>
+            <w:tcW w:type="dxa" w:w="2268"/>
+          </w:tcPr>
+          <w:p>
+            <w:pPr>
+              <w:jc w:val="left"/>
+            </w:pPr>
+            <w:r>
+              <w:rPr>
+                <w:rFonts w:ascii="Times New Roman" w:hAnsi="Times New Roman"/>
+                <w:b w:val="0"/>
+                <w:sz w:val="20"/>
+              </w:rPr>
+              <w:t>ПНР-организация</w:t>
             </w:r>
           </w:p>
         </w:tc>
@@ -221,9 +334,120 @@
             <w:r>
               <w:rPr>
                 <w:rFonts w:ascii="Times New Roman" w:hAnsi="Times New Roman"/>
+                <w:b w:val="0"/>
                 <w:sz w:val="20"/>
               </w:rPr>
-              <w:t>компл.</w:t>
+              <w:t>1</w:t>
+            </w:r>
+          </w:p>
+        </w:tc>
+      </w:tr>
+      <w:tr>
+        <w:tc>
+          <w:tcPr>
+            <w:tcW w:type="dxa" w:w="454"/>
+          </w:tcPr>
+          <w:p>
+            <w:pPr>
+              <w:jc w:val="center"/>
+            </w:pPr>
+            <w:r>
+              <w:rPr>
+                <w:rFonts w:ascii="Times New Roman" w:hAnsi="Times New Roman"/>
+                <w:b w:val="0"/>
+                <w:sz w:val="20"/>
+              </w:rPr>
+              <w:t>2</w:t>
+            </w:r>
+          </w:p>
+        </w:tc>
+        <w:tc>
+          <w:tcPr>
+            <w:tcW w:type="dxa" w:w="5386"/>
+          </w:tcPr>
+          <w:p>
+            <w:pPr>
+              <w:jc w:val="left"/>
+            </w:pPr>
+            <w:r>
+              <w:rPr>
+                <w:rFonts w:ascii="Times New Roman" w:hAnsi="Times New Roman"/>
+                <w:b w:val="0"/>
+                <w:sz w:val="20"/>
+              </w:rPr>
+              <w:t>Входной контроль поставленного оборудования</w:t>
+            </w:r>
+          </w:p>
+        </w:tc>
+        <w:tc>
+          <w:tcPr>
+            <w:tcW w:type="dxa" w:w="2154"/>
+          </w:tcPr>
+          <w:p>
+            <w:pPr>
+              <w:jc w:val="left"/>
+            </w:pPr>
+            <w:r>
+              <w:rPr>
+                <w:rFonts w:ascii="Times New Roman" w:hAnsi="Times New Roman"/>
+                <w:b w:val="0"/>
+                <w:sz w:val="20"/>
+              </w:rPr>
+              <w:t>СНиП 3.05.06-85 п.4.2</w:t>
+            </w:r>
+          </w:p>
+        </w:tc>
+        <w:tc>
+          <w:tcPr>
+            <w:tcW w:type="dxa" w:w="850"/>
+          </w:tcPr>
+          <w:p>
+            <w:pPr>
+              <w:jc w:val="center"/>
+            </w:pPr>
+            <w:r>
+              <w:rPr>
+                <w:rFonts w:ascii="Times New Roman" w:hAnsi="Times New Roman"/>
+                <w:b w:val="0"/>
+                <w:sz w:val="20"/>
+              </w:rPr>
+              <w:t>позиция</w:t>
+            </w:r>
+          </w:p>
+        </w:tc>
+        <w:tc>
+          <w:tcPr>
+            <w:tcW w:type="dxa" w:w="850"/>
+          </w:tcPr>
+          <w:p>
+            <w:pPr>
+              <w:jc w:val="center"/>
+            </w:pPr>
+            <w:r>
+              <w:rPr>
+                <w:rFonts w:ascii="Times New Roman" w:hAnsi="Times New Roman"/>
+                <w:b w:val="0"/>
+                <w:sz w:val="20"/>
+              </w:rPr>
+              <w:t>7</w:t>
+            </w:r>
+          </w:p>
+        </w:tc>
+        <w:tc>
+          <w:tcPr>
+            <w:tcW w:type="dxa" w:w="2268"/>
+          </w:tcPr>
+          <w:p>
+            <w:pPr>
+              <w:jc w:val="left"/>
+            </w:pPr>
+            <w:r>
+              <w:rPr>
+                <w:rFonts w:ascii="Times New Roman" w:hAnsi="Times New Roman"/>
+                <w:b w:val="0"/>
+                <w:sz w:val="20"/>
+              </w:rPr>
+              <w:t>Генподрядчик</w:t>
             </w:r>
           </w:p>
         </w:tc>
@@ -238,9 +462,2886 @@
             <w:r>
               <w:rPr>
                 <w:rFonts w:ascii="Times New Roman" w:hAnsi="Times New Roman"/>
+                <w:b w:val="0"/>
                 <w:sz w:val="20"/>
               </w:rPr>
               <w:t>1</w:t>
+            </w:r>
+          </w:p>
+        </w:tc>
+      </w:tr>
+      <w:tr>
+        <w:tc>
+          <w:tcPr>
+            <w:tcW w:type="dxa" w:w="454"/>
+          </w:tcPr>
+          <w:p>
+            <w:pPr>
+              <w:jc w:val="center"/>
+            </w:pPr>
+            <w:r>
+              <w:rPr>
+                <w:rFonts w:ascii="Times New Roman" w:hAnsi="Times New Roman"/>
+                <w:b w:val="0"/>
+                <w:sz w:val="20"/>
+              </w:rPr>
+              <w:t>3</w:t>
+            </w:r>
+          </w:p>
+        </w:tc>
+        <w:tc>
+          <w:tcPr>
+            <w:tcW w:type="dxa" w:w="5386"/>
+          </w:tcPr>
+          <w:p>
+            <w:pPr>
+              <w:jc w:val="left"/>
+            </w:pPr>
+            <w:r>
+              <w:rPr>
+                <w:rFonts w:ascii="Times New Roman" w:hAnsi="Times New Roman"/>
+                <w:b w:val="0"/>
+                <w:sz w:val="20"/>
+              </w:rPr>
+              <w:t>Проверка наличия и комплектности технической документации на оборудование</w:t>
+            </w:r>
+          </w:p>
+        </w:tc>
+        <w:tc>
+          <w:tcPr>
+            <w:tcW w:type="dxa" w:w="2154"/>
+          </w:tcPr>
+          <w:p>
+            <w:pPr>
+              <w:jc w:val="left"/>
+            </w:pPr>
+            <w:r>
+              <w:rPr>
+                <w:rFonts w:ascii="Times New Roman" w:hAnsi="Times New Roman"/>
+                <w:b w:val="0"/>
+                <w:sz w:val="20"/>
+              </w:rPr>
+              <w:t>ПТЭЭП п.1.5.1</w:t>
+            </w:r>
+          </w:p>
+        </w:tc>
+        <w:tc>
+          <w:tcPr>
+            <w:tcW w:type="dxa" w:w="850"/>
+          </w:tcPr>
+          <w:p>
+            <w:pPr>
+              <w:jc w:val="center"/>
+            </w:pPr>
+            <w:r>
+              <w:rPr>
+                <w:rFonts w:ascii="Times New Roman" w:hAnsi="Times New Roman"/>
+                <w:b w:val="0"/>
+                <w:sz w:val="20"/>
+              </w:rPr>
+              <w:t>компл.</w:t>
+            </w:r>
+          </w:p>
+        </w:tc>
+        <w:tc>
+          <w:tcPr>
+            <w:tcW w:type="dxa" w:w="850"/>
+          </w:tcPr>
+          <w:p>
+            <w:pPr>
+              <w:jc w:val="center"/>
+            </w:pPr>
+            <w:r>
+              <w:rPr>
+                <w:rFonts w:ascii="Times New Roman" w:hAnsi="Times New Roman"/>
+                <w:b w:val="0"/>
+                <w:sz w:val="20"/>
+              </w:rPr>
+              <w:t>1</w:t>
+            </w:r>
+          </w:p>
+        </w:tc>
+        <w:tc>
+          <w:tcPr>
+            <w:tcW w:type="dxa" w:w="2268"/>
+          </w:tcPr>
+          <w:p>
+            <w:pPr>
+              <w:jc w:val="left"/>
+            </w:pPr>
+            <w:r>
+              <w:rPr>
+                <w:rFonts w:ascii="Times New Roman" w:hAnsi="Times New Roman"/>
+                <w:b w:val="0"/>
+                <w:sz w:val="20"/>
+              </w:rPr>
+              <w:t>ПНР-организация</w:t>
+            </w:r>
+          </w:p>
+        </w:tc>
+        <w:tc>
+          <w:tcPr>
+            <w:tcW w:type="dxa" w:w="1020"/>
+          </w:tcPr>
+          <w:p>
+            <w:pPr>
+              <w:jc w:val="center"/>
+            </w:pPr>
+            <w:r>
+              <w:rPr>
+                <w:rFonts w:ascii="Times New Roman" w:hAnsi="Times New Roman"/>
+                <w:b w:val="0"/>
+                <w:sz w:val="20"/>
+              </w:rPr>
+              <w:t>1</w:t>
+            </w:r>
+          </w:p>
+        </w:tc>
+      </w:tr>
+      <w:tr>
+        <w:tc>
+          <w:tcPr>
+            <w:tcW w:type="dxa" w:w="15134"/>
+            <w:gridSpan w:val="7"/>
+          </w:tcPr>
+          <w:p>
+            <w:pPr>
+              <w:jc w:val="left"/>
+            </w:pPr>
+            <w:r>
+              <w:rPr>
+                <w:rFonts w:ascii="Times New Roman" w:hAnsi="Times New Roman"/>
+                <w:b/>
+                <w:sz w:val="20"/>
+              </w:rPr>
+              <w:t xml:space="preserve">  2. Визуальный осмотр и проверка монтажа</w:t>
+            </w:r>
+          </w:p>
+        </w:tc>
+      </w:tr>
+      <w:tr>
+        <w:tc>
+          <w:tcPr>
+            <w:tcW w:type="dxa" w:w="454"/>
+          </w:tcPr>
+          <w:p>
+            <w:pPr>
+              <w:jc w:val="center"/>
+            </w:pPr>
+            <w:r>
+              <w:rPr>
+                <w:rFonts w:ascii="Times New Roman" w:hAnsi="Times New Roman"/>
+                <w:b w:val="0"/>
+                <w:sz w:val="20"/>
+              </w:rPr>
+              <w:t>4</w:t>
+            </w:r>
+          </w:p>
+        </w:tc>
+        <w:tc>
+          <w:tcPr>
+            <w:tcW w:type="dxa" w:w="5386"/>
+          </w:tcPr>
+          <w:p>
+            <w:pPr>
+              <w:jc w:val="left"/>
+            </w:pPr>
+            <w:r>
+              <w:rPr>
+                <w:rFonts w:ascii="Times New Roman" w:hAnsi="Times New Roman"/>
+                <w:b w:val="0"/>
+                <w:sz w:val="20"/>
+              </w:rPr>
+              <w:t>Визуальный осмотр щитов, ВРУ и электрооборудования</w:t>
+            </w:r>
+          </w:p>
+        </w:tc>
+        <w:tc>
+          <w:tcPr>
+            <w:tcW w:type="dxa" w:w="2154"/>
+          </w:tcPr>
+          <w:p>
+            <w:pPr>
+              <w:jc w:val="left"/>
+            </w:pPr>
+            <w:r>
+              <w:rPr>
+                <w:rFonts w:ascii="Times New Roman" w:hAnsi="Times New Roman"/>
+                <w:b w:val="0"/>
+                <w:sz w:val="20"/>
+              </w:rPr>
+              <w:t>ПУЭ п.1.8.1</w:t>
+            </w:r>
+          </w:p>
+        </w:tc>
+        <w:tc>
+          <w:tcPr>
+            <w:tcW w:type="dxa" w:w="850"/>
+          </w:tcPr>
+          <w:p>
+            <w:pPr>
+              <w:jc w:val="center"/>
+            </w:pPr>
+            <w:r>
+              <w:rPr>
+                <w:rFonts w:ascii="Times New Roman" w:hAnsi="Times New Roman"/>
+                <w:b w:val="0"/>
+                <w:sz w:val="20"/>
+              </w:rPr>
+              <w:t>компл.</w:t>
+            </w:r>
+          </w:p>
+        </w:tc>
+        <w:tc>
+          <w:tcPr>
+            <w:tcW w:type="dxa" w:w="850"/>
+          </w:tcPr>
+          <w:p>
+            <w:pPr>
+              <w:jc w:val="center"/>
+            </w:pPr>
+            <w:r>
+              <w:rPr>
+                <w:rFonts w:ascii="Times New Roman" w:hAnsi="Times New Roman"/>
+                <w:b w:val="0"/>
+                <w:sz w:val="20"/>
+              </w:rPr>
+              <w:t>1</w:t>
+            </w:r>
+          </w:p>
+        </w:tc>
+        <w:tc>
+          <w:tcPr>
+            <w:tcW w:type="dxa" w:w="2268"/>
+          </w:tcPr>
+          <w:p>
+            <w:pPr>
+              <w:jc w:val="left"/>
+            </w:pPr>
+            <w:r>
+              <w:rPr>
+                <w:rFonts w:ascii="Times New Roman" w:hAnsi="Times New Roman"/>
+                <w:b w:val="0"/>
+                <w:sz w:val="20"/>
+              </w:rPr>
+              <w:t>ПНР-организация</w:t>
+            </w:r>
+          </w:p>
+        </w:tc>
+        <w:tc>
+          <w:tcPr>
+            <w:tcW w:type="dxa" w:w="1020"/>
+          </w:tcPr>
+          <w:p>
+            <w:pPr>
+              <w:jc w:val="center"/>
+            </w:pPr>
+            <w:r>
+              <w:rPr>
+                <w:rFonts w:ascii="Times New Roman" w:hAnsi="Times New Roman"/>
+                <w:b w:val="0"/>
+                <w:sz w:val="20"/>
+              </w:rPr>
+              <w:t>1</w:t>
+            </w:r>
+          </w:p>
+        </w:tc>
+      </w:tr>
+      <w:tr>
+        <w:tc>
+          <w:tcPr>
+            <w:tcW w:type="dxa" w:w="454"/>
+          </w:tcPr>
+          <w:p>
+            <w:pPr>
+              <w:jc w:val="center"/>
+            </w:pPr>
+            <w:r>
+              <w:rPr>
+                <w:rFonts w:ascii="Times New Roman" w:hAnsi="Times New Roman"/>
+                <w:b w:val="0"/>
+                <w:sz w:val="20"/>
+              </w:rPr>
+              <w:t>5</w:t>
+            </w:r>
+          </w:p>
+        </w:tc>
+        <w:tc>
+          <w:tcPr>
+            <w:tcW w:type="dxa" w:w="5386"/>
+          </w:tcPr>
+          <w:p>
+            <w:pPr>
+              <w:jc w:val="left"/>
+            </w:pPr>
+            <w:r>
+              <w:rPr>
+                <w:rFonts w:ascii="Times New Roman" w:hAnsi="Times New Roman"/>
+                <w:b w:val="0"/>
+                <w:sz w:val="20"/>
+              </w:rPr>
+              <w:t>Проверка соответствия монтажа проектной документации</w:t>
+            </w:r>
+          </w:p>
+        </w:tc>
+        <w:tc>
+          <w:tcPr>
+            <w:tcW w:type="dxa" w:w="2154"/>
+          </w:tcPr>
+          <w:p>
+            <w:pPr>
+              <w:jc w:val="left"/>
+            </w:pPr>
+            <w:r>
+              <w:rPr>
+                <w:rFonts w:ascii="Times New Roman" w:hAnsi="Times New Roman"/>
+                <w:b w:val="0"/>
+                <w:sz w:val="20"/>
+              </w:rPr>
+              <w:t>РД 34.20.501 п.4</w:t>
+            </w:r>
+          </w:p>
+        </w:tc>
+        <w:tc>
+          <w:tcPr>
+            <w:tcW w:type="dxa" w:w="850"/>
+          </w:tcPr>
+          <w:p>
+            <w:pPr>
+              <w:jc w:val="center"/>
+            </w:pPr>
+            <w:r>
+              <w:rPr>
+                <w:rFonts w:ascii="Times New Roman" w:hAnsi="Times New Roman"/>
+                <w:b w:val="0"/>
+                <w:sz w:val="20"/>
+              </w:rPr>
+              <w:t>компл.</w:t>
+            </w:r>
+          </w:p>
+        </w:tc>
+        <w:tc>
+          <w:tcPr>
+            <w:tcW w:type="dxa" w:w="850"/>
+          </w:tcPr>
+          <w:p>
+            <w:pPr>
+              <w:jc w:val="center"/>
+            </w:pPr>
+            <w:r>
+              <w:rPr>
+                <w:rFonts w:ascii="Times New Roman" w:hAnsi="Times New Roman"/>
+                <w:b w:val="0"/>
+                <w:sz w:val="20"/>
+              </w:rPr>
+              <w:t>1</w:t>
+            </w:r>
+          </w:p>
+        </w:tc>
+        <w:tc>
+          <w:tcPr>
+            <w:tcW w:type="dxa" w:w="2268"/>
+          </w:tcPr>
+          <w:p>
+            <w:pPr>
+              <w:jc w:val="left"/>
+            </w:pPr>
+            <w:r>
+              <w:rPr>
+                <w:rFonts w:ascii="Times New Roman" w:hAnsi="Times New Roman"/>
+                <w:b w:val="0"/>
+                <w:sz w:val="20"/>
+              </w:rPr>
+              <w:t>ПНР-организация</w:t>
+            </w:r>
+          </w:p>
+        </w:tc>
+        <w:tc>
+          <w:tcPr>
+            <w:tcW w:type="dxa" w:w="1020"/>
+          </w:tcPr>
+          <w:p>
+            <w:pPr>
+              <w:jc w:val="center"/>
+            </w:pPr>
+            <w:r>
+              <w:rPr>
+                <w:rFonts w:ascii="Times New Roman" w:hAnsi="Times New Roman"/>
+                <w:b w:val="0"/>
+                <w:sz w:val="20"/>
+              </w:rPr>
+              <w:t>1</w:t>
+            </w:r>
+          </w:p>
+        </w:tc>
+      </w:tr>
+      <w:tr>
+        <w:tc>
+          <w:tcPr>
+            <w:tcW w:type="dxa" w:w="454"/>
+          </w:tcPr>
+          <w:p>
+            <w:pPr>
+              <w:jc w:val="center"/>
+            </w:pPr>
+            <w:r>
+              <w:rPr>
+                <w:rFonts w:ascii="Times New Roman" w:hAnsi="Times New Roman"/>
+                <w:b w:val="0"/>
+                <w:sz w:val="20"/>
+              </w:rPr>
+              <w:t>6</w:t>
+            </w:r>
+          </w:p>
+        </w:tc>
+        <w:tc>
+          <w:tcPr>
+            <w:tcW w:type="dxa" w:w="5386"/>
+          </w:tcPr>
+          <w:p>
+            <w:pPr>
+              <w:jc w:val="left"/>
+            </w:pPr>
+            <w:r>
+              <w:rPr>
+                <w:rFonts w:ascii="Times New Roman" w:hAnsi="Times New Roman"/>
+                <w:b w:val="0"/>
+                <w:sz w:val="20"/>
+              </w:rPr>
+              <w:t>Проверка правильности подключения фаз и маркировки шин</w:t>
+            </w:r>
+          </w:p>
+        </w:tc>
+        <w:tc>
+          <w:tcPr>
+            <w:tcW w:type="dxa" w:w="2154"/>
+          </w:tcPr>
+          <w:p>
+            <w:pPr>
+              <w:jc w:val="left"/>
+            </w:pPr>
+            <w:r>
+              <w:rPr>
+                <w:rFonts w:ascii="Times New Roman" w:hAnsi="Times New Roman"/>
+                <w:b w:val="0"/>
+                <w:sz w:val="20"/>
+              </w:rPr>
+              <w:t>ПУЭ п.1.8.20</w:t>
+            </w:r>
+          </w:p>
+        </w:tc>
+        <w:tc>
+          <w:tcPr>
+            <w:tcW w:type="dxa" w:w="850"/>
+          </w:tcPr>
+          <w:p>
+            <w:pPr>
+              <w:jc w:val="center"/>
+            </w:pPr>
+            <w:r>
+              <w:rPr>
+                <w:rFonts w:ascii="Times New Roman" w:hAnsi="Times New Roman"/>
+                <w:b w:val="0"/>
+                <w:sz w:val="20"/>
+              </w:rPr>
+              <w:t>точка</w:t>
+            </w:r>
+          </w:p>
+        </w:tc>
+        <w:tc>
+          <w:tcPr>
+            <w:tcW w:type="dxa" w:w="850"/>
+          </w:tcPr>
+          <w:p>
+            <w:pPr>
+              <w:jc w:val="center"/>
+            </w:pPr>
+            <w:r>
+              <w:rPr>
+                <w:rFonts w:ascii="Times New Roman" w:hAnsi="Times New Roman"/>
+                <w:b w:val="0"/>
+                <w:sz w:val="20"/>
+              </w:rPr>
+              <w:t>7</w:t>
+            </w:r>
+          </w:p>
+        </w:tc>
+        <w:tc>
+          <w:tcPr>
+            <w:tcW w:type="dxa" w:w="2268"/>
+          </w:tcPr>
+          <w:p>
+            <w:pPr>
+              <w:jc w:val="left"/>
+            </w:pPr>
+            <w:r>
+              <w:rPr>
+                <w:rFonts w:ascii="Times New Roman" w:hAnsi="Times New Roman"/>
+                <w:b w:val="0"/>
+                <w:sz w:val="20"/>
+              </w:rPr>
+              <w:t>ПНР-организация</w:t>
+            </w:r>
+          </w:p>
+        </w:tc>
+        <w:tc>
+          <w:tcPr>
+            <w:tcW w:type="dxa" w:w="1020"/>
+          </w:tcPr>
+          <w:p>
+            <w:pPr>
+              <w:jc w:val="center"/>
+            </w:pPr>
+            <w:r>
+              <w:rPr>
+                <w:rFonts w:ascii="Times New Roman" w:hAnsi="Times New Roman"/>
+                <w:b w:val="0"/>
+                <w:sz w:val="20"/>
+              </w:rPr>
+              <w:t>1</w:t>
+            </w:r>
+          </w:p>
+        </w:tc>
+      </w:tr>
+      <w:tr>
+        <w:tc>
+          <w:tcPr>
+            <w:tcW w:type="dxa" w:w="454"/>
+          </w:tcPr>
+          <w:p>
+            <w:pPr>
+              <w:jc w:val="center"/>
+            </w:pPr>
+            <w:r>
+              <w:rPr>
+                <w:rFonts w:ascii="Times New Roman" w:hAnsi="Times New Roman"/>
+                <w:b w:val="0"/>
+                <w:sz w:val="20"/>
+              </w:rPr>
+              <w:t>7</w:t>
+            </w:r>
+          </w:p>
+        </w:tc>
+        <w:tc>
+          <w:tcPr>
+            <w:tcW w:type="dxa" w:w="5386"/>
+          </w:tcPr>
+          <w:p>
+            <w:pPr>
+              <w:jc w:val="left"/>
+            </w:pPr>
+            <w:r>
+              <w:rPr>
+                <w:rFonts w:ascii="Times New Roman" w:hAnsi="Times New Roman"/>
+                <w:b w:val="0"/>
+                <w:sz w:val="20"/>
+              </w:rPr>
+              <w:t>Проверка защитного заземления (PE) всех корпусов</w:t>
+            </w:r>
+          </w:p>
+        </w:tc>
+        <w:tc>
+          <w:tcPr>
+            <w:tcW w:type="dxa" w:w="2154"/>
+          </w:tcPr>
+          <w:p>
+            <w:pPr>
+              <w:jc w:val="left"/>
+            </w:pPr>
+            <w:r>
+              <w:rPr>
+                <w:rFonts w:ascii="Times New Roman" w:hAnsi="Times New Roman"/>
+                <w:b w:val="0"/>
+                <w:sz w:val="20"/>
+              </w:rPr>
+              <w:t>ПУЭ п.1.7.82</w:t>
+            </w:r>
+          </w:p>
+        </w:tc>
+        <w:tc>
+          <w:tcPr>
+            <w:tcW w:type="dxa" w:w="850"/>
+          </w:tcPr>
+          <w:p>
+            <w:pPr>
+              <w:jc w:val="center"/>
+            </w:pPr>
+            <w:r>
+              <w:rPr>
+                <w:rFonts w:ascii="Times New Roman" w:hAnsi="Times New Roman"/>
+                <w:b w:val="0"/>
+                <w:sz w:val="20"/>
+              </w:rPr>
+              <w:t>точка</w:t>
+            </w:r>
+          </w:p>
+        </w:tc>
+        <w:tc>
+          <w:tcPr>
+            <w:tcW w:type="dxa" w:w="850"/>
+          </w:tcPr>
+          <w:p>
+            <w:pPr>
+              <w:jc w:val="center"/>
+            </w:pPr>
+            <w:r>
+              <w:rPr>
+                <w:rFonts w:ascii="Times New Roman" w:hAnsi="Times New Roman"/>
+                <w:b w:val="0"/>
+                <w:sz w:val="20"/>
+              </w:rPr>
+              <w:t>7</w:t>
+            </w:r>
+          </w:p>
+        </w:tc>
+        <w:tc>
+          <w:tcPr>
+            <w:tcW w:type="dxa" w:w="2268"/>
+          </w:tcPr>
+          <w:p>
+            <w:pPr>
+              <w:jc w:val="left"/>
+            </w:pPr>
+            <w:r>
+              <w:rPr>
+                <w:rFonts w:ascii="Times New Roman" w:hAnsi="Times New Roman"/>
+                <w:b w:val="0"/>
+                <w:sz w:val="20"/>
+              </w:rPr>
+              <w:t>ПНР-организация</w:t>
+            </w:r>
+          </w:p>
+        </w:tc>
+        <w:tc>
+          <w:tcPr>
+            <w:tcW w:type="dxa" w:w="1020"/>
+          </w:tcPr>
+          <w:p>
+            <w:pPr>
+              <w:jc w:val="center"/>
+            </w:pPr>
+            <w:r>
+              <w:rPr>
+                <w:rFonts w:ascii="Times New Roman" w:hAnsi="Times New Roman"/>
+                <w:b w:val="0"/>
+                <w:sz w:val="20"/>
+              </w:rPr>
+              <w:t>1</w:t>
+            </w:r>
+          </w:p>
+        </w:tc>
+      </w:tr>
+      <w:tr>
+        <w:tc>
+          <w:tcPr>
+            <w:tcW w:type="dxa" w:w="15134"/>
+            <w:gridSpan w:val="7"/>
+          </w:tcPr>
+          <w:p>
+            <w:pPr>
+              <w:jc w:val="left"/>
+            </w:pPr>
+            <w:r>
+              <w:rPr>
+                <w:rFonts w:ascii="Times New Roman" w:hAnsi="Times New Roman"/>
+                <w:b/>
+                <w:sz w:val="20"/>
+              </w:rPr>
+              <w:t xml:space="preserve">  3. Измерения и испытания изоляции</w:t>
+            </w:r>
+          </w:p>
+        </w:tc>
+      </w:tr>
+      <w:tr>
+        <w:tc>
+          <w:tcPr>
+            <w:tcW w:type="dxa" w:w="454"/>
+          </w:tcPr>
+          <w:p>
+            <w:pPr>
+              <w:jc w:val="center"/>
+            </w:pPr>
+            <w:r>
+              <w:rPr>
+                <w:rFonts w:ascii="Times New Roman" w:hAnsi="Times New Roman"/>
+                <w:b w:val="0"/>
+                <w:sz w:val="20"/>
+              </w:rPr>
+              <w:t>8</w:t>
+            </w:r>
+          </w:p>
+        </w:tc>
+        <w:tc>
+          <w:tcPr>
+            <w:tcW w:type="dxa" w:w="5386"/>
+          </w:tcPr>
+          <w:p>
+            <w:pPr>
+              <w:jc w:val="left"/>
+            </w:pPr>
+            <w:r>
+              <w:rPr>
+                <w:rFonts w:ascii="Times New Roman" w:hAnsi="Times New Roman"/>
+                <w:b w:val="0"/>
+                <w:sz w:val="20"/>
+              </w:rPr>
+              <w:t>Измерение сопротивления изоляции кабелей (Uисп=1000 В)</w:t>
+            </w:r>
+          </w:p>
+        </w:tc>
+        <w:tc>
+          <w:tcPr>
+            <w:tcW w:type="dxa" w:w="2154"/>
+          </w:tcPr>
+          <w:p>
+            <w:pPr>
+              <w:jc w:val="left"/>
+            </w:pPr>
+            <w:r>
+              <w:rPr>
+                <w:rFonts w:ascii="Times New Roman" w:hAnsi="Times New Roman"/>
+                <w:b w:val="0"/>
+                <w:sz w:val="20"/>
+              </w:rPr>
+              <w:t>ПУЭ п.1.8.37</w:t>
+            </w:r>
+          </w:p>
+        </w:tc>
+        <w:tc>
+          <w:tcPr>
+            <w:tcW w:type="dxa" w:w="850"/>
+          </w:tcPr>
+          <w:p>
+            <w:pPr>
+              <w:jc w:val="center"/>
+            </w:pPr>
+            <w:r>
+              <w:rPr>
+                <w:rFonts w:ascii="Times New Roman" w:hAnsi="Times New Roman"/>
+                <w:b w:val="0"/>
+                <w:sz w:val="20"/>
+              </w:rPr>
+              <w:t>линия</w:t>
+            </w:r>
+          </w:p>
+        </w:tc>
+        <w:tc>
+          <w:tcPr>
+            <w:tcW w:type="dxa" w:w="850"/>
+          </w:tcPr>
+          <w:p>
+            <w:pPr>
+              <w:jc w:val="center"/>
+            </w:pPr>
+            <w:r>
+              <w:rPr>
+                <w:rFonts w:ascii="Times New Roman" w:hAnsi="Times New Roman"/>
+                <w:b w:val="0"/>
+                <w:sz w:val="20"/>
+              </w:rPr>
+              <w:t>19</w:t>
+            </w:r>
+          </w:p>
+        </w:tc>
+        <w:tc>
+          <w:tcPr>
+            <w:tcW w:type="dxa" w:w="2268"/>
+          </w:tcPr>
+          <w:p>
+            <w:pPr>
+              <w:jc w:val="left"/>
+            </w:pPr>
+            <w:r>
+              <w:rPr>
+                <w:rFonts w:ascii="Times New Roman" w:hAnsi="Times New Roman"/>
+                <w:b w:val="0"/>
+                <w:sz w:val="20"/>
+              </w:rPr>
+              <w:t>ПНР-организация</w:t>
+            </w:r>
+          </w:p>
+        </w:tc>
+        <w:tc>
+          <w:tcPr>
+            <w:tcW w:type="dxa" w:w="1020"/>
+          </w:tcPr>
+          <w:p>
+            <w:pPr>
+              <w:jc w:val="center"/>
+            </w:pPr>
+            <w:r>
+              <w:rPr>
+                <w:rFonts w:ascii="Times New Roman" w:hAnsi="Times New Roman"/>
+                <w:b w:val="0"/>
+                <w:sz w:val="20"/>
+              </w:rPr>
+              <w:t>2</w:t>
+            </w:r>
+          </w:p>
+        </w:tc>
+      </w:tr>
+      <w:tr>
+        <w:tc>
+          <w:tcPr>
+            <w:tcW w:type="dxa" w:w="454"/>
+          </w:tcPr>
+          <w:p>
+            <w:pPr>
+              <w:jc w:val="center"/>
+            </w:pPr>
+            <w:r>
+              <w:rPr>
+                <w:rFonts w:ascii="Times New Roman" w:hAnsi="Times New Roman"/>
+                <w:b w:val="0"/>
+                <w:sz w:val="20"/>
+              </w:rPr>
+              <w:t>9</w:t>
+            </w:r>
+          </w:p>
+        </w:tc>
+        <w:tc>
+          <w:tcPr>
+            <w:tcW w:type="dxa" w:w="5386"/>
+          </w:tcPr>
+          <w:p>
+            <w:pPr>
+              <w:jc w:val="left"/>
+            </w:pPr>
+            <w:r>
+              <w:rPr>
+                <w:rFonts w:ascii="Times New Roman" w:hAnsi="Times New Roman"/>
+                <w:b w:val="0"/>
+                <w:sz w:val="20"/>
+              </w:rPr>
+              <w:t>Измерение сопротивления петли фаза-нуль</w:t>
+            </w:r>
+          </w:p>
+        </w:tc>
+        <w:tc>
+          <w:tcPr>
+            <w:tcW w:type="dxa" w:w="2154"/>
+          </w:tcPr>
+          <w:p>
+            <w:pPr>
+              <w:jc w:val="left"/>
+            </w:pPr>
+            <w:r>
+              <w:rPr>
+                <w:rFonts w:ascii="Times New Roman" w:hAnsi="Times New Roman"/>
+                <w:b w:val="0"/>
+                <w:sz w:val="20"/>
+              </w:rPr>
+              <w:t>ПУЭ п.1.8.36</w:t>
+            </w:r>
+          </w:p>
+        </w:tc>
+        <w:tc>
+          <w:tcPr>
+            <w:tcW w:type="dxa" w:w="850"/>
+          </w:tcPr>
+          <w:p>
+            <w:pPr>
+              <w:jc w:val="center"/>
+            </w:pPr>
+            <w:r>
+              <w:rPr>
+                <w:rFonts w:ascii="Times New Roman" w:hAnsi="Times New Roman"/>
+                <w:b w:val="0"/>
+                <w:sz w:val="20"/>
+              </w:rPr>
+              <w:t>точка</w:t>
+            </w:r>
+          </w:p>
+        </w:tc>
+        <w:tc>
+          <w:tcPr>
+            <w:tcW w:type="dxa" w:w="850"/>
+          </w:tcPr>
+          <w:p>
+            <w:pPr>
+              <w:jc w:val="center"/>
+            </w:pPr>
+            <w:r>
+              <w:rPr>
+                <w:rFonts w:ascii="Times New Roman" w:hAnsi="Times New Roman"/>
+                <w:b w:val="0"/>
+                <w:sz w:val="20"/>
+              </w:rPr>
+              <w:t>18</w:t>
+            </w:r>
+          </w:p>
+        </w:tc>
+        <w:tc>
+          <w:tcPr>
+            <w:tcW w:type="dxa" w:w="2268"/>
+          </w:tcPr>
+          <w:p>
+            <w:pPr>
+              <w:jc w:val="left"/>
+            </w:pPr>
+            <w:r>
+              <w:rPr>
+                <w:rFonts w:ascii="Times New Roman" w:hAnsi="Times New Roman"/>
+                <w:b w:val="0"/>
+                <w:sz w:val="20"/>
+              </w:rPr>
+              <w:t>ПНР-организация</w:t>
+            </w:r>
+          </w:p>
+        </w:tc>
+        <w:tc>
+          <w:tcPr>
+            <w:tcW w:type="dxa" w:w="1020"/>
+          </w:tcPr>
+          <w:p>
+            <w:pPr>
+              <w:jc w:val="center"/>
+            </w:pPr>
+            <w:r>
+              <w:rPr>
+                <w:rFonts w:ascii="Times New Roman" w:hAnsi="Times New Roman"/>
+                <w:b w:val="0"/>
+                <w:sz w:val="20"/>
+              </w:rPr>
+              <w:t>1</w:t>
+            </w:r>
+          </w:p>
+        </w:tc>
+      </w:tr>
+      <w:tr>
+        <w:tc>
+          <w:tcPr>
+            <w:tcW w:type="dxa" w:w="454"/>
+          </w:tcPr>
+          <w:p>
+            <w:pPr>
+              <w:jc w:val="center"/>
+            </w:pPr>
+            <w:r>
+              <w:rPr>
+                <w:rFonts w:ascii="Times New Roman" w:hAnsi="Times New Roman"/>
+                <w:b w:val="0"/>
+                <w:sz w:val="20"/>
+              </w:rPr>
+              <w:t>10</w:t>
+            </w:r>
+          </w:p>
+        </w:tc>
+        <w:tc>
+          <w:tcPr>
+            <w:tcW w:type="dxa" w:w="5386"/>
+          </w:tcPr>
+          <w:p>
+            <w:pPr>
+              <w:jc w:val="left"/>
+            </w:pPr>
+            <w:r>
+              <w:rPr>
+                <w:rFonts w:ascii="Times New Roman" w:hAnsi="Times New Roman"/>
+                <w:b w:val="0"/>
+                <w:sz w:val="20"/>
+              </w:rPr>
+              <w:t>Измерение сопротивления заземляющего устройства</w:t>
+            </w:r>
+          </w:p>
+        </w:tc>
+        <w:tc>
+          <w:tcPr>
+            <w:tcW w:type="dxa" w:w="2154"/>
+          </w:tcPr>
+          <w:p>
+            <w:pPr>
+              <w:jc w:val="left"/>
+            </w:pPr>
+            <w:r>
+              <w:rPr>
+                <w:rFonts w:ascii="Times New Roman" w:hAnsi="Times New Roman"/>
+                <w:b w:val="0"/>
+                <w:sz w:val="20"/>
+              </w:rPr>
+              <w:t>ПУЭ п.1.8.39</w:t>
+            </w:r>
+          </w:p>
+        </w:tc>
+        <w:tc>
+          <w:tcPr>
+            <w:tcW w:type="dxa" w:w="850"/>
+          </w:tcPr>
+          <w:p>
+            <w:pPr>
+              <w:jc w:val="center"/>
+            </w:pPr>
+            <w:r>
+              <w:rPr>
+                <w:rFonts w:ascii="Times New Roman" w:hAnsi="Times New Roman"/>
+                <w:b w:val="0"/>
+                <w:sz w:val="20"/>
+              </w:rPr>
+              <w:t>замер</w:t>
+            </w:r>
+          </w:p>
+        </w:tc>
+        <w:tc>
+          <w:tcPr>
+            <w:tcW w:type="dxa" w:w="850"/>
+          </w:tcPr>
+          <w:p>
+            <w:pPr>
+              <w:jc w:val="center"/>
+            </w:pPr>
+            <w:r>
+              <w:rPr>
+                <w:rFonts w:ascii="Times New Roman" w:hAnsi="Times New Roman"/>
+                <w:b w:val="0"/>
+                <w:sz w:val="20"/>
+              </w:rPr>
+              <w:t>1</w:t>
+            </w:r>
+          </w:p>
+        </w:tc>
+        <w:tc>
+          <w:tcPr>
+            <w:tcW w:type="dxa" w:w="2268"/>
+          </w:tcPr>
+          <w:p>
+            <w:pPr>
+              <w:jc w:val="left"/>
+            </w:pPr>
+            <w:r>
+              <w:rPr>
+                <w:rFonts w:ascii="Times New Roman" w:hAnsi="Times New Roman"/>
+                <w:b w:val="0"/>
+                <w:sz w:val="20"/>
+              </w:rPr>
+              <w:t>ПНР-организация</w:t>
+            </w:r>
+          </w:p>
+        </w:tc>
+        <w:tc>
+          <w:tcPr>
+            <w:tcW w:type="dxa" w:w="1020"/>
+          </w:tcPr>
+          <w:p>
+            <w:pPr>
+              <w:jc w:val="center"/>
+            </w:pPr>
+            <w:r>
+              <w:rPr>
+                <w:rFonts w:ascii="Times New Roman" w:hAnsi="Times New Roman"/>
+                <w:b w:val="0"/>
+                <w:sz w:val="20"/>
+              </w:rPr>
+              <w:t>1</w:t>
+            </w:r>
+          </w:p>
+        </w:tc>
+      </w:tr>
+      <w:tr>
+        <w:tc>
+          <w:tcPr>
+            <w:tcW w:type="dxa" w:w="454"/>
+          </w:tcPr>
+          <w:p>
+            <w:pPr>
+              <w:jc w:val="center"/>
+            </w:pPr>
+            <w:r>
+              <w:rPr>
+                <w:rFonts w:ascii="Times New Roman" w:hAnsi="Times New Roman"/>
+                <w:b w:val="0"/>
+                <w:sz w:val="20"/>
+              </w:rPr>
+              <w:t>11</w:t>
+            </w:r>
+          </w:p>
+        </w:tc>
+        <w:tc>
+          <w:tcPr>
+            <w:tcW w:type="dxa" w:w="5386"/>
+          </w:tcPr>
+          <w:p>
+            <w:pPr>
+              <w:jc w:val="left"/>
+            </w:pPr>
+            <w:r>
+              <w:rPr>
+                <w:rFonts w:ascii="Times New Roman" w:hAnsi="Times New Roman"/>
+                <w:b w:val="0"/>
+                <w:sz w:val="20"/>
+              </w:rPr>
+              <w:t>Проверка огнестойкости кабельных линий кат.1 (FRLS-кабели)</w:t>
+            </w:r>
+          </w:p>
+        </w:tc>
+        <w:tc>
+          <w:tcPr>
+            <w:tcW w:type="dxa" w:w="2154"/>
+          </w:tcPr>
+          <w:p>
+            <w:pPr>
+              <w:jc w:val="left"/>
+            </w:pPr>
+            <w:r>
+              <w:rPr>
+                <w:rFonts w:ascii="Times New Roman" w:hAnsi="Times New Roman"/>
+                <w:b w:val="0"/>
+                <w:sz w:val="20"/>
+              </w:rPr>
+              <w:t>СП 6.13130.2021 п.4.14</w:t>
+            </w:r>
+          </w:p>
+        </w:tc>
+        <w:tc>
+          <w:tcPr>
+            <w:tcW w:type="dxa" w:w="850"/>
+          </w:tcPr>
+          <w:p>
+            <w:pPr>
+              <w:jc w:val="center"/>
+            </w:pPr>
+            <w:r>
+              <w:rPr>
+                <w:rFonts w:ascii="Times New Roman" w:hAnsi="Times New Roman"/>
+                <w:b w:val="0"/>
+                <w:sz w:val="20"/>
+              </w:rPr>
+              <w:t>линия</w:t>
+            </w:r>
+          </w:p>
+        </w:tc>
+        <w:tc>
+          <w:tcPr>
+            <w:tcW w:type="dxa" w:w="850"/>
+          </w:tcPr>
+          <w:p>
+            <w:pPr>
+              <w:jc w:val="center"/>
+            </w:pPr>
+            <w:r>
+              <w:rPr>
+                <w:rFonts w:ascii="Times New Roman" w:hAnsi="Times New Roman"/>
+                <w:b w:val="0"/>
+                <w:sz w:val="20"/>
+              </w:rPr>
+              <w:t>2</w:t>
+            </w:r>
+          </w:p>
+        </w:tc>
+        <w:tc>
+          <w:tcPr>
+            <w:tcW w:type="dxa" w:w="2268"/>
+          </w:tcPr>
+          <w:p>
+            <w:pPr>
+              <w:jc w:val="left"/>
+            </w:pPr>
+            <w:r>
+              <w:rPr>
+                <w:rFonts w:ascii="Times New Roman" w:hAnsi="Times New Roman"/>
+                <w:b w:val="0"/>
+                <w:sz w:val="20"/>
+              </w:rPr>
+              <w:t>ПНР-организация</w:t>
+            </w:r>
+          </w:p>
+        </w:tc>
+        <w:tc>
+          <w:tcPr>
+            <w:tcW w:type="dxa" w:w="1020"/>
+          </w:tcPr>
+          <w:p>
+            <w:pPr>
+              <w:jc w:val="center"/>
+            </w:pPr>
+            <w:r>
+              <w:rPr>
+                <w:rFonts w:ascii="Times New Roman" w:hAnsi="Times New Roman"/>
+                <w:b w:val="0"/>
+                <w:sz w:val="20"/>
+              </w:rPr>
+              <w:t>1</w:t>
+            </w:r>
+          </w:p>
+        </w:tc>
+      </w:tr>
+      <w:tr>
+        <w:tc>
+          <w:tcPr>
+            <w:tcW w:type="dxa" w:w="15134"/>
+            <w:gridSpan w:val="7"/>
+          </w:tcPr>
+          <w:p>
+            <w:pPr>
+              <w:jc w:val="left"/>
+            </w:pPr>
+            <w:r>
+              <w:rPr>
+                <w:rFonts w:ascii="Times New Roman" w:hAnsi="Times New Roman"/>
+                <w:b/>
+                <w:sz w:val="20"/>
+              </w:rPr>
+              <w:t xml:space="preserve">  4. Наладка защитной аппаратуры</w:t>
+            </w:r>
+          </w:p>
+        </w:tc>
+      </w:tr>
+      <w:tr>
+        <w:tc>
+          <w:tcPr>
+            <w:tcW w:type="dxa" w:w="454"/>
+          </w:tcPr>
+          <w:p>
+            <w:pPr>
+              <w:jc w:val="center"/>
+            </w:pPr>
+            <w:r>
+              <w:rPr>
+                <w:rFonts w:ascii="Times New Roman" w:hAnsi="Times New Roman"/>
+                <w:b w:val="0"/>
+                <w:sz w:val="20"/>
+              </w:rPr>
+              <w:t>12</w:t>
+            </w:r>
+          </w:p>
+        </w:tc>
+        <w:tc>
+          <w:tcPr>
+            <w:tcW w:type="dxa" w:w="5386"/>
+          </w:tcPr>
+          <w:p>
+            <w:pPr>
+              <w:jc w:val="left"/>
+            </w:pPr>
+            <w:r>
+              <w:rPr>
+                <w:rFonts w:ascii="Times New Roman" w:hAnsi="Times New Roman"/>
+                <w:b w:val="0"/>
+                <w:sz w:val="20"/>
+              </w:rPr>
+              <w:t>Проверка срабатывания автоматических выключателей (расцепление)</w:t>
+            </w:r>
+          </w:p>
+        </w:tc>
+        <w:tc>
+          <w:tcPr>
+            <w:tcW w:type="dxa" w:w="2154"/>
+          </w:tcPr>
+          <w:p>
+            <w:pPr>
+              <w:jc w:val="left"/>
+            </w:pPr>
+            <w:r>
+              <w:rPr>
+                <w:rFonts w:ascii="Times New Roman" w:hAnsi="Times New Roman"/>
+                <w:b w:val="0"/>
+                <w:sz w:val="20"/>
+              </w:rPr>
+              <w:t>ГОСТ Р 50345-2010</w:t>
+            </w:r>
+          </w:p>
+        </w:tc>
+        <w:tc>
+          <w:tcPr>
+            <w:tcW w:type="dxa" w:w="850"/>
+          </w:tcPr>
+          <w:p>
+            <w:pPr>
+              <w:jc w:val="center"/>
+            </w:pPr>
+            <w:r>
+              <w:rPr>
+                <w:rFonts w:ascii="Times New Roman" w:hAnsi="Times New Roman"/>
+                <w:b w:val="0"/>
+                <w:sz w:val="20"/>
+              </w:rPr>
+              <w:t>шт.</w:t>
+            </w:r>
+          </w:p>
+        </w:tc>
+        <w:tc>
+          <w:tcPr>
+            <w:tcW w:type="dxa" w:w="850"/>
+          </w:tcPr>
+          <w:p>
+            <w:pPr>
+              <w:jc w:val="center"/>
+            </w:pPr>
+            <w:r>
+              <w:rPr>
+                <w:rFonts w:ascii="Times New Roman" w:hAnsi="Times New Roman"/>
+                <w:b w:val="0"/>
+                <w:sz w:val="20"/>
+              </w:rPr>
+              <w:t>12</w:t>
+            </w:r>
+          </w:p>
+        </w:tc>
+        <w:tc>
+          <w:tcPr>
+            <w:tcW w:type="dxa" w:w="2268"/>
+          </w:tcPr>
+          <w:p>
+            <w:pPr>
+              <w:jc w:val="left"/>
+            </w:pPr>
+            <w:r>
+              <w:rPr>
+                <w:rFonts w:ascii="Times New Roman" w:hAnsi="Times New Roman"/>
+                <w:b w:val="0"/>
+                <w:sz w:val="20"/>
+              </w:rPr>
+              <w:t>ПНР-организация</w:t>
+            </w:r>
+          </w:p>
+        </w:tc>
+        <w:tc>
+          <w:tcPr>
+            <w:tcW w:type="dxa" w:w="1020"/>
+          </w:tcPr>
+          <w:p>
+            <w:pPr>
+              <w:jc w:val="center"/>
+            </w:pPr>
+            <w:r>
+              <w:rPr>
+                <w:rFonts w:ascii="Times New Roman" w:hAnsi="Times New Roman"/>
+                <w:b w:val="0"/>
+                <w:sz w:val="20"/>
+              </w:rPr>
+              <w:t>1</w:t>
+            </w:r>
+          </w:p>
+        </w:tc>
+      </w:tr>
+      <w:tr>
+        <w:tc>
+          <w:tcPr>
+            <w:tcW w:type="dxa" w:w="454"/>
+          </w:tcPr>
+          <w:p>
+            <w:pPr>
+              <w:jc w:val="center"/>
+            </w:pPr>
+            <w:r>
+              <w:rPr>
+                <w:rFonts w:ascii="Times New Roman" w:hAnsi="Times New Roman"/>
+                <w:b w:val="0"/>
+                <w:sz w:val="20"/>
+              </w:rPr>
+              <w:t>13</w:t>
+            </w:r>
+          </w:p>
+        </w:tc>
+        <w:tc>
+          <w:tcPr>
+            <w:tcW w:type="dxa" w:w="5386"/>
+          </w:tcPr>
+          <w:p>
+            <w:pPr>
+              <w:jc w:val="left"/>
+            </w:pPr>
+            <w:r>
+              <w:rPr>
+                <w:rFonts w:ascii="Times New Roman" w:hAnsi="Times New Roman"/>
+                <w:b w:val="0"/>
+                <w:sz w:val="20"/>
+              </w:rPr>
+              <w:t>Проверка уставок расцепителей и соответствия номиналов АВ</w:t>
+            </w:r>
+          </w:p>
+        </w:tc>
+        <w:tc>
+          <w:tcPr>
+            <w:tcW w:type="dxa" w:w="2154"/>
+          </w:tcPr>
+          <w:p>
+            <w:pPr>
+              <w:jc w:val="left"/>
+            </w:pPr>
+            <w:r>
+              <w:rPr>
+                <w:rFonts w:ascii="Times New Roman" w:hAnsi="Times New Roman"/>
+                <w:b w:val="0"/>
+                <w:sz w:val="20"/>
+              </w:rPr>
+              <w:t>ГОСТ Р 50345-2010</w:t>
+            </w:r>
+          </w:p>
+        </w:tc>
+        <w:tc>
+          <w:tcPr>
+            <w:tcW w:type="dxa" w:w="850"/>
+          </w:tcPr>
+          <w:p>
+            <w:pPr>
+              <w:jc w:val="center"/>
+            </w:pPr>
+            <w:r>
+              <w:rPr>
+                <w:rFonts w:ascii="Times New Roman" w:hAnsi="Times New Roman"/>
+                <w:b w:val="0"/>
+                <w:sz w:val="20"/>
+              </w:rPr>
+              <w:t>шт.</w:t>
+            </w:r>
+          </w:p>
+        </w:tc>
+        <w:tc>
+          <w:tcPr>
+            <w:tcW w:type="dxa" w:w="850"/>
+          </w:tcPr>
+          <w:p>
+            <w:pPr>
+              <w:jc w:val="center"/>
+            </w:pPr>
+            <w:r>
+              <w:rPr>
+                <w:rFonts w:ascii="Times New Roman" w:hAnsi="Times New Roman"/>
+                <w:b w:val="0"/>
+                <w:sz w:val="20"/>
+              </w:rPr>
+              <w:t>12</w:t>
+            </w:r>
+          </w:p>
+        </w:tc>
+        <w:tc>
+          <w:tcPr>
+            <w:tcW w:type="dxa" w:w="2268"/>
+          </w:tcPr>
+          <w:p>
+            <w:pPr>
+              <w:jc w:val="left"/>
+            </w:pPr>
+            <w:r>
+              <w:rPr>
+                <w:rFonts w:ascii="Times New Roman" w:hAnsi="Times New Roman"/>
+                <w:b w:val="0"/>
+                <w:sz w:val="20"/>
+              </w:rPr>
+              <w:t>ПНР-организация</w:t>
+            </w:r>
+          </w:p>
+        </w:tc>
+        <w:tc>
+          <w:tcPr>
+            <w:tcW w:type="dxa" w:w="1020"/>
+          </w:tcPr>
+          <w:p>
+            <w:pPr>
+              <w:jc w:val="center"/>
+            </w:pPr>
+            <w:r>
+              <w:rPr>
+                <w:rFonts w:ascii="Times New Roman" w:hAnsi="Times New Roman"/>
+                <w:b w:val="0"/>
+                <w:sz w:val="20"/>
+              </w:rPr>
+              <w:t>1</w:t>
+            </w:r>
+          </w:p>
+        </w:tc>
+      </w:tr>
+      <w:tr>
+        <w:tc>
+          <w:tcPr>
+            <w:tcW w:type="dxa" w:w="454"/>
+          </w:tcPr>
+          <w:p>
+            <w:pPr>
+              <w:jc w:val="center"/>
+            </w:pPr>
+            <w:r>
+              <w:rPr>
+                <w:rFonts w:ascii="Times New Roman" w:hAnsi="Times New Roman"/>
+                <w:b w:val="0"/>
+                <w:sz w:val="20"/>
+              </w:rPr>
+              <w:t>14</w:t>
+            </w:r>
+          </w:p>
+        </w:tc>
+        <w:tc>
+          <w:tcPr>
+            <w:tcW w:type="dxa" w:w="5386"/>
+          </w:tcPr>
+          <w:p>
+            <w:pPr>
+              <w:jc w:val="left"/>
+            </w:pPr>
+            <w:r>
+              <w:rPr>
+                <w:rFonts w:ascii="Times New Roman" w:hAnsi="Times New Roman"/>
+                <w:b w:val="0"/>
+                <w:sz w:val="20"/>
+              </w:rPr>
+              <w:t>Наладка и испытание блоков АВР (имитация пропадания напряжения)</w:t>
+            </w:r>
+          </w:p>
+        </w:tc>
+        <w:tc>
+          <w:tcPr>
+            <w:tcW w:type="dxa" w:w="2154"/>
+          </w:tcPr>
+          <w:p>
+            <w:pPr>
+              <w:jc w:val="left"/>
+            </w:pPr>
+            <w:r>
+              <w:rPr>
+                <w:rFonts w:ascii="Times New Roman" w:hAnsi="Times New Roman"/>
+                <w:b w:val="0"/>
+                <w:sz w:val="20"/>
+              </w:rPr>
+              <w:t>ГОСТ Р МЭК 60947-6-1</w:t>
+            </w:r>
+          </w:p>
+        </w:tc>
+        <w:tc>
+          <w:tcPr>
+            <w:tcW w:type="dxa" w:w="850"/>
+          </w:tcPr>
+          <w:p>
+            <w:pPr>
+              <w:jc w:val="center"/>
+            </w:pPr>
+            <w:r>
+              <w:rPr>
+                <w:rFonts w:ascii="Times New Roman" w:hAnsi="Times New Roman"/>
+                <w:b w:val="0"/>
+                <w:sz w:val="20"/>
+              </w:rPr>
+              <w:t>шт.</w:t>
+            </w:r>
+          </w:p>
+        </w:tc>
+        <w:tc>
+          <w:tcPr>
+            <w:tcW w:type="dxa" w:w="850"/>
+          </w:tcPr>
+          <w:p>
+            <w:pPr>
+              <w:jc w:val="center"/>
+            </w:pPr>
+            <w:r>
+              <w:rPr>
+                <w:rFonts w:ascii="Times New Roman" w:hAnsi="Times New Roman"/>
+                <w:b w:val="0"/>
+                <w:sz w:val="20"/>
+              </w:rPr>
+              <w:t>1</w:t>
+            </w:r>
+          </w:p>
+        </w:tc>
+        <w:tc>
+          <w:tcPr>
+            <w:tcW w:type="dxa" w:w="2268"/>
+          </w:tcPr>
+          <w:p>
+            <w:pPr>
+              <w:jc w:val="left"/>
+            </w:pPr>
+            <w:r>
+              <w:rPr>
+                <w:rFonts w:ascii="Times New Roman" w:hAnsi="Times New Roman"/>
+                <w:b w:val="0"/>
+                <w:sz w:val="20"/>
+              </w:rPr>
+              <w:t>ПНР-организация</w:t>
+            </w:r>
+          </w:p>
+        </w:tc>
+        <w:tc>
+          <w:tcPr>
+            <w:tcW w:type="dxa" w:w="1020"/>
+          </w:tcPr>
+          <w:p>
+            <w:pPr>
+              <w:jc w:val="center"/>
+            </w:pPr>
+            <w:r>
+              <w:rPr>
+                <w:rFonts w:ascii="Times New Roman" w:hAnsi="Times New Roman"/>
+                <w:b w:val="0"/>
+                <w:sz w:val="20"/>
+              </w:rPr>
+              <w:t>1</w:t>
+            </w:r>
+          </w:p>
+        </w:tc>
+      </w:tr>
+      <w:tr>
+        <w:tc>
+          <w:tcPr>
+            <w:tcW w:type="dxa" w:w="454"/>
+          </w:tcPr>
+          <w:p>
+            <w:pPr>
+              <w:jc w:val="center"/>
+            </w:pPr>
+            <w:r>
+              <w:rPr>
+                <w:rFonts w:ascii="Times New Roman" w:hAnsi="Times New Roman"/>
+                <w:b w:val="0"/>
+                <w:sz w:val="20"/>
+              </w:rPr>
+              <w:t>15</w:t>
+            </w:r>
+          </w:p>
+        </w:tc>
+        <w:tc>
+          <w:tcPr>
+            <w:tcW w:type="dxa" w:w="5386"/>
+          </w:tcPr>
+          <w:p>
+            <w:pPr>
+              <w:jc w:val="left"/>
+            </w:pPr>
+            <w:r>
+              <w:rPr>
+                <w:rFonts w:ascii="Times New Roman" w:hAnsi="Times New Roman"/>
+                <w:b w:val="0"/>
+                <w:sz w:val="20"/>
+              </w:rPr>
+              <w:t>Проверка времени переключения АВР (не более 0.5 с)</w:t>
+            </w:r>
+          </w:p>
+        </w:tc>
+        <w:tc>
+          <w:tcPr>
+            <w:tcW w:type="dxa" w:w="2154"/>
+          </w:tcPr>
+          <w:p>
+            <w:pPr>
+              <w:jc w:val="left"/>
+            </w:pPr>
+            <w:r>
+              <w:rPr>
+                <w:rFonts w:ascii="Times New Roman" w:hAnsi="Times New Roman"/>
+                <w:b w:val="0"/>
+                <w:sz w:val="20"/>
+              </w:rPr>
+              <w:t>ПУЭ п.1.2.18</w:t>
+            </w:r>
+          </w:p>
+        </w:tc>
+        <w:tc>
+          <w:tcPr>
+            <w:tcW w:type="dxa" w:w="850"/>
+          </w:tcPr>
+          <w:p>
+            <w:pPr>
+              <w:jc w:val="center"/>
+            </w:pPr>
+            <w:r>
+              <w:rPr>
+                <w:rFonts w:ascii="Times New Roman" w:hAnsi="Times New Roman"/>
+                <w:b w:val="0"/>
+                <w:sz w:val="20"/>
+              </w:rPr>
+              <w:t>шт.</w:t>
+            </w:r>
+          </w:p>
+        </w:tc>
+        <w:tc>
+          <w:tcPr>
+            <w:tcW w:type="dxa" w:w="850"/>
+          </w:tcPr>
+          <w:p>
+            <w:pPr>
+              <w:jc w:val="center"/>
+            </w:pPr>
+            <w:r>
+              <w:rPr>
+                <w:rFonts w:ascii="Times New Roman" w:hAnsi="Times New Roman"/>
+                <w:b w:val="0"/>
+                <w:sz w:val="20"/>
+              </w:rPr>
+              <w:t>1</w:t>
+            </w:r>
+          </w:p>
+        </w:tc>
+        <w:tc>
+          <w:tcPr>
+            <w:tcW w:type="dxa" w:w="2268"/>
+          </w:tcPr>
+          <w:p>
+            <w:pPr>
+              <w:jc w:val="left"/>
+            </w:pPr>
+            <w:r>
+              <w:rPr>
+                <w:rFonts w:ascii="Times New Roman" w:hAnsi="Times New Roman"/>
+                <w:b w:val="0"/>
+                <w:sz w:val="20"/>
+              </w:rPr>
+              <w:t>ПНР-организация</w:t>
+            </w:r>
+          </w:p>
+        </w:tc>
+        <w:tc>
+          <w:tcPr>
+            <w:tcW w:type="dxa" w:w="1020"/>
+          </w:tcPr>
+          <w:p>
+            <w:pPr>
+              <w:jc w:val="center"/>
+            </w:pPr>
+            <w:r>
+              <w:rPr>
+                <w:rFonts w:ascii="Times New Roman" w:hAnsi="Times New Roman"/>
+                <w:b w:val="0"/>
+                <w:sz w:val="20"/>
+              </w:rPr>
+              <w:t>1</w:t>
+            </w:r>
+          </w:p>
+        </w:tc>
+      </w:tr>
+      <w:tr>
+        <w:tc>
+          <w:tcPr>
+            <w:tcW w:type="dxa" w:w="15134"/>
+            <w:gridSpan w:val="7"/>
+          </w:tcPr>
+          <w:p>
+            <w:pPr>
+              <w:jc w:val="left"/>
+            </w:pPr>
+            <w:r>
+              <w:rPr>
+                <w:rFonts w:ascii="Times New Roman" w:hAnsi="Times New Roman"/>
+                <w:b/>
+                <w:sz w:val="20"/>
+              </w:rPr>
+              <w:t xml:space="preserve">  5. Комплексные испытания под нагрузкой</w:t>
+            </w:r>
+          </w:p>
+        </w:tc>
+      </w:tr>
+      <w:tr>
+        <w:tc>
+          <w:tcPr>
+            <w:tcW w:type="dxa" w:w="454"/>
+          </w:tcPr>
+          <w:p>
+            <w:pPr>
+              <w:jc w:val="center"/>
+            </w:pPr>
+            <w:r>
+              <w:rPr>
+                <w:rFonts w:ascii="Times New Roman" w:hAnsi="Times New Roman"/>
+                <w:b w:val="0"/>
+                <w:sz w:val="20"/>
+              </w:rPr>
+              <w:t>16</w:t>
+            </w:r>
+          </w:p>
+        </w:tc>
+        <w:tc>
+          <w:tcPr>
+            <w:tcW w:type="dxa" w:w="5386"/>
+          </w:tcPr>
+          <w:p>
+            <w:pPr>
+              <w:jc w:val="left"/>
+            </w:pPr>
+            <w:r>
+              <w:rPr>
+                <w:rFonts w:ascii="Times New Roman" w:hAnsi="Times New Roman"/>
+                <w:b w:val="0"/>
+                <w:sz w:val="20"/>
+              </w:rPr>
+              <w:t>Рабочее включение ВРУ и щитов, проверка токов нагрузки</w:t>
+            </w:r>
+          </w:p>
+        </w:tc>
+        <w:tc>
+          <w:tcPr>
+            <w:tcW w:type="dxa" w:w="2154"/>
+          </w:tcPr>
+          <w:p>
+            <w:pPr>
+              <w:jc w:val="left"/>
+            </w:pPr>
+            <w:r>
+              <w:rPr>
+                <w:rFonts w:ascii="Times New Roman" w:hAnsi="Times New Roman"/>
+                <w:b w:val="0"/>
+                <w:sz w:val="20"/>
+              </w:rPr>
+              <w:t>РД 34.20.501 п.6.2</w:t>
+            </w:r>
+          </w:p>
+        </w:tc>
+        <w:tc>
+          <w:tcPr>
+            <w:tcW w:type="dxa" w:w="850"/>
+          </w:tcPr>
+          <w:p>
+            <w:pPr>
+              <w:jc w:val="center"/>
+            </w:pPr>
+            <w:r>
+              <w:rPr>
+                <w:rFonts w:ascii="Times New Roman" w:hAnsi="Times New Roman"/>
+                <w:b w:val="0"/>
+                <w:sz w:val="20"/>
+              </w:rPr>
+              <w:t>компл.</w:t>
+            </w:r>
+          </w:p>
+        </w:tc>
+        <w:tc>
+          <w:tcPr>
+            <w:tcW w:type="dxa" w:w="850"/>
+          </w:tcPr>
+          <w:p>
+            <w:pPr>
+              <w:jc w:val="center"/>
+            </w:pPr>
+            <w:r>
+              <w:rPr>
+                <w:rFonts w:ascii="Times New Roman" w:hAnsi="Times New Roman"/>
+                <w:b w:val="0"/>
+                <w:sz w:val="20"/>
+              </w:rPr>
+              <w:t>1</w:t>
+            </w:r>
+          </w:p>
+        </w:tc>
+        <w:tc>
+          <w:tcPr>
+            <w:tcW w:type="dxa" w:w="2268"/>
+          </w:tcPr>
+          <w:p>
+            <w:pPr>
+              <w:jc w:val="left"/>
+            </w:pPr>
+            <w:r>
+              <w:rPr>
+                <w:rFonts w:ascii="Times New Roman" w:hAnsi="Times New Roman"/>
+                <w:b w:val="0"/>
+                <w:sz w:val="20"/>
+              </w:rPr>
+              <w:t>ПНР-организация</w:t>
+            </w:r>
+          </w:p>
+        </w:tc>
+        <w:tc>
+          <w:tcPr>
+            <w:tcW w:type="dxa" w:w="1020"/>
+          </w:tcPr>
+          <w:p>
+            <w:pPr>
+              <w:jc w:val="center"/>
+            </w:pPr>
+            <w:r>
+              <w:rPr>
+                <w:rFonts w:ascii="Times New Roman" w:hAnsi="Times New Roman"/>
+                <w:b w:val="0"/>
+                <w:sz w:val="20"/>
+              </w:rPr>
+              <w:t>1</w:t>
+            </w:r>
+          </w:p>
+        </w:tc>
+      </w:tr>
+      <w:tr>
+        <w:tc>
+          <w:tcPr>
+            <w:tcW w:type="dxa" w:w="454"/>
+          </w:tcPr>
+          <w:p>
+            <w:pPr>
+              <w:jc w:val="center"/>
+            </w:pPr>
+            <w:r>
+              <w:rPr>
+                <w:rFonts w:ascii="Times New Roman" w:hAnsi="Times New Roman"/>
+                <w:b w:val="0"/>
+                <w:sz w:val="20"/>
+              </w:rPr>
+              <w:t>17</w:t>
+            </w:r>
+          </w:p>
+        </w:tc>
+        <w:tc>
+          <w:tcPr>
+            <w:tcW w:type="dxa" w:w="5386"/>
+          </w:tcPr>
+          <w:p>
+            <w:pPr>
+              <w:jc w:val="left"/>
+            </w:pPr>
+            <w:r>
+              <w:rPr>
+                <w:rFonts w:ascii="Times New Roman" w:hAnsi="Times New Roman"/>
+                <w:b w:val="0"/>
+                <w:sz w:val="20"/>
+              </w:rPr>
+              <w:t>Замер рабочих токов и напряжений под нагрузкой</w:t>
+            </w:r>
+          </w:p>
+        </w:tc>
+        <w:tc>
+          <w:tcPr>
+            <w:tcW w:type="dxa" w:w="2154"/>
+          </w:tcPr>
+          <w:p>
+            <w:pPr>
+              <w:jc w:val="left"/>
+            </w:pPr>
+            <w:r>
+              <w:rPr>
+                <w:rFonts w:ascii="Times New Roman" w:hAnsi="Times New Roman"/>
+                <w:b w:val="0"/>
+                <w:sz w:val="20"/>
+              </w:rPr>
+              <w:t>ПТЭЭП п.2.7.7</w:t>
+            </w:r>
+          </w:p>
+        </w:tc>
+        <w:tc>
+          <w:tcPr>
+            <w:tcW w:type="dxa" w:w="850"/>
+          </w:tcPr>
+          <w:p>
+            <w:pPr>
+              <w:jc w:val="center"/>
+            </w:pPr>
+            <w:r>
+              <w:rPr>
+                <w:rFonts w:ascii="Times New Roman" w:hAnsi="Times New Roman"/>
+                <w:b w:val="0"/>
+                <w:sz w:val="20"/>
+              </w:rPr>
+              <w:t>точка</w:t>
+            </w:r>
+          </w:p>
+        </w:tc>
+        <w:tc>
+          <w:tcPr>
+            <w:tcW w:type="dxa" w:w="850"/>
+          </w:tcPr>
+          <w:p>
+            <w:pPr>
+              <w:jc w:val="center"/>
+            </w:pPr>
+            <w:r>
+              <w:rPr>
+                <w:rFonts w:ascii="Times New Roman" w:hAnsi="Times New Roman"/>
+                <w:b w:val="0"/>
+                <w:sz w:val="20"/>
+              </w:rPr>
+              <w:t>7</w:t>
+            </w:r>
+          </w:p>
+        </w:tc>
+        <w:tc>
+          <w:tcPr>
+            <w:tcW w:type="dxa" w:w="2268"/>
+          </w:tcPr>
+          <w:p>
+            <w:pPr>
+              <w:jc w:val="left"/>
+            </w:pPr>
+            <w:r>
+              <w:rPr>
+                <w:rFonts w:ascii="Times New Roman" w:hAnsi="Times New Roman"/>
+                <w:b w:val="0"/>
+                <w:sz w:val="20"/>
+              </w:rPr>
+              <w:t>ПНР-организация</w:t>
+            </w:r>
+          </w:p>
+        </w:tc>
+        <w:tc>
+          <w:tcPr>
+            <w:tcW w:type="dxa" w:w="1020"/>
+          </w:tcPr>
+          <w:p>
+            <w:pPr>
+              <w:jc w:val="center"/>
+            </w:pPr>
+            <w:r>
+              <w:rPr>
+                <w:rFonts w:ascii="Times New Roman" w:hAnsi="Times New Roman"/>
+                <w:b w:val="0"/>
+                <w:sz w:val="20"/>
+              </w:rPr>
+              <w:t>1</w:t>
+            </w:r>
+          </w:p>
+        </w:tc>
+      </w:tr>
+      <w:tr>
+        <w:tc>
+          <w:tcPr>
+            <w:tcW w:type="dxa" w:w="454"/>
+          </w:tcPr>
+          <w:p>
+            <w:pPr>
+              <w:jc w:val="center"/>
+            </w:pPr>
+            <w:r>
+              <w:rPr>
+                <w:rFonts w:ascii="Times New Roman" w:hAnsi="Times New Roman"/>
+                <w:b w:val="0"/>
+                <w:sz w:val="20"/>
+              </w:rPr>
+              <w:t>18</w:t>
+            </w:r>
+          </w:p>
+        </w:tc>
+        <w:tc>
+          <w:tcPr>
+            <w:tcW w:type="dxa" w:w="5386"/>
+          </w:tcPr>
+          <w:p>
+            <w:pPr>
+              <w:jc w:val="left"/>
+            </w:pPr>
+            <w:r>
+              <w:rPr>
+                <w:rFonts w:ascii="Times New Roman" w:hAnsi="Times New Roman"/>
+                <w:b w:val="0"/>
+                <w:sz w:val="20"/>
+              </w:rPr>
+              <w:t>Проверка симметрии нагрузки по фазам</w:t>
+            </w:r>
+          </w:p>
+        </w:tc>
+        <w:tc>
+          <w:tcPr>
+            <w:tcW w:type="dxa" w:w="2154"/>
+          </w:tcPr>
+          <w:p>
+            <w:pPr>
+              <w:jc w:val="left"/>
+            </w:pPr>
+            <w:r>
+              <w:rPr>
+                <w:rFonts w:ascii="Times New Roman" w:hAnsi="Times New Roman"/>
+                <w:b w:val="0"/>
+                <w:sz w:val="20"/>
+              </w:rPr>
+              <w:t>ПТЭЭП п.2.7.7</w:t>
+            </w:r>
+          </w:p>
+        </w:tc>
+        <w:tc>
+          <w:tcPr>
+            <w:tcW w:type="dxa" w:w="850"/>
+          </w:tcPr>
+          <w:p>
+            <w:pPr>
+              <w:jc w:val="center"/>
+            </w:pPr>
+            <w:r>
+              <w:rPr>
+                <w:rFonts w:ascii="Times New Roman" w:hAnsi="Times New Roman"/>
+                <w:b w:val="0"/>
+                <w:sz w:val="20"/>
+              </w:rPr>
+              <w:t>компл.</w:t>
+            </w:r>
+          </w:p>
+        </w:tc>
+        <w:tc>
+          <w:tcPr>
+            <w:tcW w:type="dxa" w:w="850"/>
+          </w:tcPr>
+          <w:p>
+            <w:pPr>
+              <w:jc w:val="center"/>
+            </w:pPr>
+            <w:r>
+              <w:rPr>
+                <w:rFonts w:ascii="Times New Roman" w:hAnsi="Times New Roman"/>
+                <w:b w:val="0"/>
+                <w:sz w:val="20"/>
+              </w:rPr>
+              <w:t>1</w:t>
+            </w:r>
+          </w:p>
+        </w:tc>
+        <w:tc>
+          <w:tcPr>
+            <w:tcW w:type="dxa" w:w="2268"/>
+          </w:tcPr>
+          <w:p>
+            <w:pPr>
+              <w:jc w:val="left"/>
+            </w:pPr>
+            <w:r>
+              <w:rPr>
+                <w:rFonts w:ascii="Times New Roman" w:hAnsi="Times New Roman"/>
+                <w:b w:val="0"/>
+                <w:sz w:val="20"/>
+              </w:rPr>
+              <w:t>ПНР-организация</w:t>
+            </w:r>
+          </w:p>
+        </w:tc>
+        <w:tc>
+          <w:tcPr>
+            <w:tcW w:type="dxa" w:w="1020"/>
+          </w:tcPr>
+          <w:p>
+            <w:pPr>
+              <w:jc w:val="center"/>
+            </w:pPr>
+            <w:r>
+              <w:rPr>
+                <w:rFonts w:ascii="Times New Roman" w:hAnsi="Times New Roman"/>
+                <w:b w:val="0"/>
+                <w:sz w:val="20"/>
+              </w:rPr>
+              <w:t>1</w:t>
+            </w:r>
+          </w:p>
+        </w:tc>
+      </w:tr>
+      <w:tr>
+        <w:tc>
+          <w:tcPr>
+            <w:tcW w:type="dxa" w:w="454"/>
+          </w:tcPr>
+          <w:p>
+            <w:pPr>
+              <w:jc w:val="center"/>
+            </w:pPr>
+            <w:r>
+              <w:rPr>
+                <w:rFonts w:ascii="Times New Roman" w:hAnsi="Times New Roman"/>
+                <w:b w:val="0"/>
+                <w:sz w:val="20"/>
+              </w:rPr>
+              <w:t>19</w:t>
+            </w:r>
+          </w:p>
+        </w:tc>
+        <w:tc>
+          <w:tcPr>
+            <w:tcW w:type="dxa" w:w="5386"/>
+          </w:tcPr>
+          <w:p>
+            <w:pPr>
+              <w:jc w:val="left"/>
+            </w:pPr>
+            <w:r>
+              <w:rPr>
+                <w:rFonts w:ascii="Times New Roman" w:hAnsi="Times New Roman"/>
+                <w:b w:val="0"/>
+                <w:sz w:val="20"/>
+              </w:rPr>
+              <w:t>Комплексная проверка АВР под нагрузкой</w:t>
+            </w:r>
+          </w:p>
+        </w:tc>
+        <w:tc>
+          <w:tcPr>
+            <w:tcW w:type="dxa" w:w="2154"/>
+          </w:tcPr>
+          <w:p>
+            <w:pPr>
+              <w:jc w:val="left"/>
+            </w:pPr>
+            <w:r>
+              <w:rPr>
+                <w:rFonts w:ascii="Times New Roman" w:hAnsi="Times New Roman"/>
+                <w:b w:val="0"/>
+                <w:sz w:val="20"/>
+              </w:rPr>
+              <w:t>ПУЭ п.1.2.18</w:t>
+            </w:r>
+          </w:p>
+        </w:tc>
+        <w:tc>
+          <w:tcPr>
+            <w:tcW w:type="dxa" w:w="850"/>
+          </w:tcPr>
+          <w:p>
+            <w:pPr>
+              <w:jc w:val="center"/>
+            </w:pPr>
+            <w:r>
+              <w:rPr>
+                <w:rFonts w:ascii="Times New Roman" w:hAnsi="Times New Roman"/>
+                <w:b w:val="0"/>
+                <w:sz w:val="20"/>
+              </w:rPr>
+              <w:t>шт.</w:t>
+            </w:r>
+          </w:p>
+        </w:tc>
+        <w:tc>
+          <w:tcPr>
+            <w:tcW w:type="dxa" w:w="850"/>
+          </w:tcPr>
+          <w:p>
+            <w:pPr>
+              <w:jc w:val="center"/>
+            </w:pPr>
+            <w:r>
+              <w:rPr>
+                <w:rFonts w:ascii="Times New Roman" w:hAnsi="Times New Roman"/>
+                <w:b w:val="0"/>
+                <w:sz w:val="20"/>
+              </w:rPr>
+              <w:t>1</w:t>
+            </w:r>
+          </w:p>
+        </w:tc>
+        <w:tc>
+          <w:tcPr>
+            <w:tcW w:type="dxa" w:w="2268"/>
+          </w:tcPr>
+          <w:p>
+            <w:pPr>
+              <w:jc w:val="left"/>
+            </w:pPr>
+            <w:r>
+              <w:rPr>
+                <w:rFonts w:ascii="Times New Roman" w:hAnsi="Times New Roman"/>
+                <w:b w:val="0"/>
+                <w:sz w:val="20"/>
+              </w:rPr>
+              <w:t>ПНР-организация</w:t>
+            </w:r>
+          </w:p>
+        </w:tc>
+        <w:tc>
+          <w:tcPr>
+            <w:tcW w:type="dxa" w:w="1020"/>
+          </w:tcPr>
+          <w:p>
+            <w:pPr>
+              <w:jc w:val="center"/>
+            </w:pPr>
+            <w:r>
+              <w:rPr>
+                <w:rFonts w:ascii="Times New Roman" w:hAnsi="Times New Roman"/>
+                <w:b w:val="0"/>
+                <w:sz w:val="20"/>
+              </w:rPr>
+              <w:t>1</w:t>
+            </w:r>
+          </w:p>
+        </w:tc>
+      </w:tr>
+      <w:tr>
+        <w:tc>
+          <w:tcPr>
+            <w:tcW w:type="dxa" w:w="15134"/>
+            <w:gridSpan w:val="7"/>
+          </w:tcPr>
+          <w:p>
+            <w:pPr>
+              <w:jc w:val="left"/>
+            </w:pPr>
+            <w:r>
+              <w:rPr>
+                <w:rFonts w:ascii="Times New Roman" w:hAnsi="Times New Roman"/>
+                <w:b/>
+                <w:sz w:val="20"/>
+              </w:rPr>
+              <w:t xml:space="preserve">  6. Оформление документации</w:t>
+            </w:r>
+          </w:p>
+        </w:tc>
+      </w:tr>
+      <w:tr>
+        <w:tc>
+          <w:tcPr>
+            <w:tcW w:type="dxa" w:w="454"/>
+          </w:tcPr>
+          <w:p>
+            <w:pPr>
+              <w:jc w:val="center"/>
+            </w:pPr>
+            <w:r>
+              <w:rPr>
+                <w:rFonts w:ascii="Times New Roman" w:hAnsi="Times New Roman"/>
+                <w:b w:val="0"/>
+                <w:sz w:val="20"/>
+              </w:rPr>
+              <w:t>20</w:t>
+            </w:r>
+          </w:p>
+        </w:tc>
+        <w:tc>
+          <w:tcPr>
+            <w:tcW w:type="dxa" w:w="5386"/>
+          </w:tcPr>
+          <w:p>
+            <w:pPr>
+              <w:jc w:val="left"/>
+            </w:pPr>
+            <w:r>
+              <w:rPr>
+                <w:rFonts w:ascii="Times New Roman" w:hAnsi="Times New Roman"/>
+                <w:b w:val="0"/>
+                <w:sz w:val="20"/>
+              </w:rPr>
+              <w:t>Оформление протоколов измерений и испытаний</w:t>
+            </w:r>
+          </w:p>
+        </w:tc>
+        <w:tc>
+          <w:tcPr>
+            <w:tcW w:type="dxa" w:w="2154"/>
+          </w:tcPr>
+          <w:p>
+            <w:pPr>
+              <w:jc w:val="left"/>
+            </w:pPr>
+            <w:r>
+              <w:rPr>
+                <w:rFonts w:ascii="Times New Roman" w:hAnsi="Times New Roman"/>
+                <w:b w:val="0"/>
+                <w:sz w:val="20"/>
+              </w:rPr>
+              <w:t>ГОСТ Р 50571.16-2007</w:t>
+            </w:r>
+          </w:p>
+        </w:tc>
+        <w:tc>
+          <w:tcPr>
+            <w:tcW w:type="dxa" w:w="850"/>
+          </w:tcPr>
+          <w:p>
+            <w:pPr>
+              <w:jc w:val="center"/>
+            </w:pPr>
+            <w:r>
+              <w:rPr>
+                <w:rFonts w:ascii="Times New Roman" w:hAnsi="Times New Roman"/>
+                <w:b w:val="0"/>
+                <w:sz w:val="20"/>
+              </w:rPr>
+              <w:t>компл.</w:t>
+            </w:r>
+          </w:p>
+        </w:tc>
+        <w:tc>
+          <w:tcPr>
+            <w:tcW w:type="dxa" w:w="850"/>
+          </w:tcPr>
+          <w:p>
+            <w:pPr>
+              <w:jc w:val="center"/>
+            </w:pPr>
+            <w:r>
+              <w:rPr>
+                <w:rFonts w:ascii="Times New Roman" w:hAnsi="Times New Roman"/>
+                <w:b w:val="0"/>
+                <w:sz w:val="20"/>
+              </w:rPr>
+              <w:t>1</w:t>
+            </w:r>
+          </w:p>
+        </w:tc>
+        <w:tc>
+          <w:tcPr>
+            <w:tcW w:type="dxa" w:w="2268"/>
+          </w:tcPr>
+          <w:p>
+            <w:pPr>
+              <w:jc w:val="left"/>
+            </w:pPr>
+            <w:r>
+              <w:rPr>
+                <w:rFonts w:ascii="Times New Roman" w:hAnsi="Times New Roman"/>
+                <w:b w:val="0"/>
+                <w:sz w:val="20"/>
+              </w:rPr>
+              <w:t>ПНР-организация</w:t>
+            </w:r>
+          </w:p>
+        </w:tc>
+        <w:tc>
+          <w:tcPr>
+            <w:tcW w:type="dxa" w:w="1020"/>
+          </w:tcPr>
+          <w:p>
+            <w:pPr>
+              <w:jc w:val="center"/>
+            </w:pPr>
+            <w:r>
+              <w:rPr>
+                <w:rFonts w:ascii="Times New Roman" w:hAnsi="Times New Roman"/>
+                <w:b w:val="0"/>
+                <w:sz w:val="20"/>
+              </w:rPr>
+              <w:t>1</w:t>
+            </w:r>
+          </w:p>
+        </w:tc>
+      </w:tr>
+      <w:tr>
+        <w:tc>
+          <w:tcPr>
+            <w:tcW w:type="dxa" w:w="454"/>
+          </w:tcPr>
+          <w:p>
+            <w:pPr>
+              <w:jc w:val="center"/>
+            </w:pPr>
+            <w:r>
+              <w:rPr>
+                <w:rFonts w:ascii="Times New Roman" w:hAnsi="Times New Roman"/>
+                <w:b w:val="0"/>
+                <w:sz w:val="20"/>
+              </w:rPr>
+              <w:t>21</w:t>
+            </w:r>
+          </w:p>
+        </w:tc>
+        <w:tc>
+          <w:tcPr>
+            <w:tcW w:type="dxa" w:w="5386"/>
+          </w:tcPr>
+          <w:p>
+            <w:pPr>
+              <w:jc w:val="left"/>
+            </w:pPr>
+            <w:r>
+              <w:rPr>
+                <w:rFonts w:ascii="Times New Roman" w:hAnsi="Times New Roman"/>
+                <w:b w:val="0"/>
+                <w:sz w:val="20"/>
+              </w:rPr>
+              <w:t>Составление акта технической готовности электроустановки</w:t>
+            </w:r>
+          </w:p>
+        </w:tc>
+        <w:tc>
+          <w:tcPr>
+            <w:tcW w:type="dxa" w:w="2154"/>
+          </w:tcPr>
+          <w:p>
+            <w:pPr>
+              <w:jc w:val="left"/>
+            </w:pPr>
+            <w:r>
+              <w:rPr>
+                <w:rFonts w:ascii="Times New Roman" w:hAnsi="Times New Roman"/>
+                <w:b w:val="0"/>
+                <w:sz w:val="20"/>
+              </w:rPr>
+              <w:t>РД 34.20.501</w:t>
+            </w:r>
+          </w:p>
+        </w:tc>
+        <w:tc>
+          <w:tcPr>
+            <w:tcW w:type="dxa" w:w="850"/>
+          </w:tcPr>
+          <w:p>
+            <w:pPr>
+              <w:jc w:val="center"/>
+            </w:pPr>
+            <w:r>
+              <w:rPr>
+                <w:rFonts w:ascii="Times New Roman" w:hAnsi="Times New Roman"/>
+                <w:b w:val="0"/>
+                <w:sz w:val="20"/>
+              </w:rPr>
+              <w:t>акт</w:t>
+            </w:r>
+          </w:p>
+        </w:tc>
+        <w:tc>
+          <w:tcPr>
+            <w:tcW w:type="dxa" w:w="850"/>
+          </w:tcPr>
+          <w:p>
+            <w:pPr>
+              <w:jc w:val="center"/>
+            </w:pPr>
+            <w:r>
+              <w:rPr>
+                <w:rFonts w:ascii="Times New Roman" w:hAnsi="Times New Roman"/>
+                <w:b w:val="0"/>
+                <w:sz w:val="20"/>
+              </w:rPr>
+              <w:t>1</w:t>
+            </w:r>
+          </w:p>
+        </w:tc>
+        <w:tc>
+          <w:tcPr>
+            <w:tcW w:type="dxa" w:w="2268"/>
+          </w:tcPr>
+          <w:p>
+            <w:pPr>
+              <w:jc w:val="left"/>
+            </w:pPr>
+            <w:r>
+              <w:rPr>
+                <w:rFonts w:ascii="Times New Roman" w:hAnsi="Times New Roman"/>
+                <w:b w:val="0"/>
+                <w:sz w:val="20"/>
+              </w:rPr>
+              <w:t>ПНР-организация / Заказчик</w:t>
+            </w:r>
+          </w:p>
+        </w:tc>
+        <w:tc>
+          <w:tcPr>
+            <w:tcW w:type="dxa" w:w="1020"/>
+          </w:tcPr>
+          <w:p>
+            <w:pPr>
+              <w:jc w:val="center"/>
+            </w:pPr>
+            <w:r>
+              <w:rPr>
+                <w:rFonts w:ascii="Times New Roman" w:hAnsi="Times New Roman"/>
+                <w:b w:val="0"/>
+                <w:sz w:val="20"/>
+              </w:rPr>
+              <w:t>1</w:t>
+            </w:r>
+          </w:p>
+        </w:tc>
+      </w:tr>
+      <w:tr>
+        <w:tc>
+          <w:tcPr>
+            <w:tcW w:type="dxa" w:w="454"/>
+          </w:tcPr>
+          <w:p>
+            <w:pPr>
+              <w:jc w:val="center"/>
+            </w:pPr>
+            <w:r>
+              <w:rPr>
+                <w:rFonts w:ascii="Times New Roman" w:hAnsi="Times New Roman"/>
+                <w:b w:val="0"/>
+                <w:sz w:val="20"/>
+              </w:rPr>
+              <w:t>22</w:t>
+            </w:r>
+          </w:p>
+        </w:tc>
+        <w:tc>
+          <w:tcPr>
+            <w:tcW w:type="dxa" w:w="5386"/>
+          </w:tcPr>
+          <w:p>
+            <w:pPr>
+              <w:jc w:val="left"/>
+            </w:pPr>
+            <w:r>
+              <w:rPr>
+                <w:rFonts w:ascii="Times New Roman" w:hAnsi="Times New Roman"/>
+                <w:b w:val="0"/>
+                <w:sz w:val="20"/>
+              </w:rPr>
+              <w:t>Передача исполнительной документации заказчику</w:t>
+            </w:r>
+          </w:p>
+        </w:tc>
+        <w:tc>
+          <w:tcPr>
+            <w:tcW w:type="dxa" w:w="2154"/>
+          </w:tcPr>
+          <w:p>
+            <w:pPr>
+              <w:jc w:val="left"/>
+            </w:pPr>
+            <w:r>
+              <w:rPr>
+                <w:rFonts w:ascii="Times New Roman" w:hAnsi="Times New Roman"/>
+                <w:b w:val="0"/>
+                <w:sz w:val="20"/>
+              </w:rPr>
+              <w:t>СНиП 3.05.06-85 п.4.8</w:t>
+            </w:r>
+          </w:p>
+        </w:tc>
+        <w:tc>
+          <w:tcPr>
+            <w:tcW w:type="dxa" w:w="850"/>
+          </w:tcPr>
+          <w:p>
+            <w:pPr>
+              <w:jc w:val="center"/>
+            </w:pPr>
+            <w:r>
+              <w:rPr>
+                <w:rFonts w:ascii="Times New Roman" w:hAnsi="Times New Roman"/>
+                <w:b w:val="0"/>
+                <w:sz w:val="20"/>
+              </w:rPr>
+              <w:t>компл.</w:t>
+            </w:r>
+          </w:p>
+        </w:tc>
+        <w:tc>
+          <w:tcPr>
+            <w:tcW w:type="dxa" w:w="850"/>
+          </w:tcPr>
+          <w:p>
+            <w:pPr>
+              <w:jc w:val="center"/>
+            </w:pPr>
+            <w:r>
+              <w:rPr>
+                <w:rFonts w:ascii="Times New Roman" w:hAnsi="Times New Roman"/>
+                <w:b w:val="0"/>
+                <w:sz w:val="20"/>
+              </w:rPr>
+              <w:t>1</w:t>
+            </w:r>
+          </w:p>
+        </w:tc>
+        <w:tc>
+          <w:tcPr>
+            <w:tcW w:type="dxa" w:w="2268"/>
+          </w:tcPr>
+          <w:p>
+            <w:pPr>
+              <w:jc w:val="left"/>
+            </w:pPr>
+            <w:r>
+              <w:rPr>
+                <w:rFonts w:ascii="Times New Roman" w:hAnsi="Times New Roman"/>
+                <w:b w:val="0"/>
+                <w:sz w:val="20"/>
+              </w:rPr>
+              <w:t>Генподрядчик</w:t>
+            </w:r>
+          </w:p>
+        </w:tc>
+        <w:tc>
+          <w:tcPr>
+            <w:tcW w:type="dxa" w:w="1020"/>
+          </w:tcPr>
+          <w:p>
+            <w:pPr>
+              <w:jc w:val="center"/>
+            </w:pPr>
+            <w:r>
+              <w:rPr>
+                <w:rFonts w:ascii="Times New Roman" w:hAnsi="Times New Roman"/>
+                <w:b w:val="0"/>
+                <w:sz w:val="20"/>
+              </w:rPr>
+              <w:t>1</w:t>
+            </w:r>
+          </w:p>
+        </w:tc>
+      </w:tr>
+      <w:tr>
+        <w:tc>
+          <w:tcPr>
+            <w:tcW w:type="dxa" w:w="454"/>
+          </w:tcPr>
+          <w:p>
+            <w:pPr>
+              <w:jc w:val="center"/>
+            </w:pPr>
+            <w:r>
+              <w:rPr>
+                <w:rFonts w:ascii="Times New Roman" w:hAnsi="Times New Roman"/>
+                <w:b w:val="0"/>
+                <w:sz w:val="20"/>
+              </w:rPr>
+              <w:t>23</w:t>
+            </w:r>
+          </w:p>
+        </w:tc>
+        <w:tc>
+          <w:tcPr>
+            <w:tcW w:type="dxa" w:w="5386"/>
+          </w:tcPr>
+          <w:p>
+            <w:pPr>
+              <w:jc w:val="left"/>
+            </w:pPr>
+            <w:r>
+              <w:rPr>
+                <w:rFonts w:ascii="Times New Roman" w:hAnsi="Times New Roman"/>
+                <w:b w:val="0"/>
+                <w:sz w:val="20"/>
+              </w:rPr>
+              <w:t>Инструктаж персонала заказчика по эксплуатации ЭУ</w:t>
+            </w:r>
+          </w:p>
+        </w:tc>
+        <w:tc>
+          <w:tcPr>
+            <w:tcW w:type="dxa" w:w="2154"/>
+          </w:tcPr>
+          <w:p>
+            <w:pPr>
+              <w:jc w:val="left"/>
+            </w:pPr>
+            <w:r>
+              <w:rPr>
+                <w:rFonts w:ascii="Times New Roman" w:hAnsi="Times New Roman"/>
+                <w:b w:val="0"/>
+                <w:sz w:val="20"/>
+              </w:rPr>
+              <w:t>ПТЭЭП п.1.4.3</w:t>
+            </w:r>
+          </w:p>
+        </w:tc>
+        <w:tc>
+          <w:tcPr>
+            <w:tcW w:type="dxa" w:w="850"/>
+          </w:tcPr>
+          <w:p>
+            <w:pPr>
+              <w:jc w:val="center"/>
+            </w:pPr>
+            <w:r>
+              <w:rPr>
+                <w:rFonts w:ascii="Times New Roman" w:hAnsi="Times New Roman"/>
+                <w:b w:val="0"/>
+                <w:sz w:val="20"/>
+              </w:rPr>
+              <w:t>компл.</w:t>
+            </w:r>
+          </w:p>
+        </w:tc>
+        <w:tc>
+          <w:tcPr>
+            <w:tcW w:type="dxa" w:w="850"/>
+          </w:tcPr>
+          <w:p>
+            <w:pPr>
+              <w:jc w:val="center"/>
+            </w:pPr>
+            <w:r>
+              <w:rPr>
+                <w:rFonts w:ascii="Times New Roman" w:hAnsi="Times New Roman"/>
+                <w:b w:val="0"/>
+                <w:sz w:val="20"/>
+              </w:rPr>
+              <w:t>1</w:t>
+            </w:r>
+          </w:p>
+        </w:tc>
+        <w:tc>
+          <w:tcPr>
+            <w:tcW w:type="dxa" w:w="2268"/>
+          </w:tcPr>
+          <w:p>
+            <w:pPr>
+              <w:jc w:val="left"/>
+            </w:pPr>
+            <w:r>
+              <w:rPr>
+                <w:rFonts w:ascii="Times New Roman" w:hAnsi="Times New Roman"/>
+                <w:b w:val="0"/>
+                <w:sz w:val="20"/>
+              </w:rPr>
+              <w:t>Заказчик</w:t>
+            </w:r>
+          </w:p>
+        </w:tc>
+        <w:tc>
+          <w:tcPr>
+            <w:tcW w:type="dxa" w:w="1020"/>
+          </w:tcPr>
+          <w:p>
+            <w:pPr>
+              <w:jc w:val="center"/>
+            </w:pPr>
+            <w:r>
+              <w:rPr>
+                <w:rFonts w:ascii="Times New Roman" w:hAnsi="Times New Roman"/>
+                <w:b w:val="0"/>
+                <w:sz w:val="20"/>
+              </w:rPr>
+              <w:t>1</w:t>
+            </w:r>
+          </w:p>
+        </w:tc>
+      </w:tr>
+    </w:tbl>
+    <w:p/>
+    <w:p>
+      <w:pPr>
+        <w:jc w:val="left"/>
+      </w:pPr>
+      <w:r>
+        <w:rPr>
+          <w:rFonts w:ascii="Times New Roman" w:hAnsi="Times New Roman"/>
+          <w:sz w:val="20"/>
+        </w:rPr>
+        <w:t>Итого этапов ПНР: 23  |  Расчётная продолжительность: 24 рабочих дней</w:t>
+      </w:r>
+    </w:p>
+    <w:p/>
+    <w:tbl>
+      <w:tblPr>
+        <w:tblStyle w:val="TableGrid"/>
+        <w:tblW w:type="auto" w:w="0"/>
+        <w:tblLook w:firstColumn="1" w:firstRow="1" w:lastColumn="0" w:lastRow="0" w:noHBand="0" w:noVBand="1" w:val="04A0"/>
+      </w:tblPr>
+      <w:tblGrid>
+        <w:gridCol w:w="3784"/>
+        <w:gridCol w:w="3784"/>
+        <w:gridCol w:w="3784"/>
+        <w:gridCol w:w="3784"/>
+      </w:tblGrid>
+      <w:tr>
+        <w:tc>
+          <w:tcPr>
+            <w:tcW w:type="dxa" w:w="2268"/>
+          </w:tcPr>
+          <w:p>
+            <w:pPr>
+              <w:jc w:val="center"/>
+            </w:pPr>
+            <w:r>
+              <w:rPr>
+                <w:rFonts w:ascii="Times New Roman" w:hAnsi="Times New Roman"/>
+                <w:b/>
+                <w:sz w:val="20"/>
+              </w:rPr>
+              <w:t>Должность</w:t>
+            </w:r>
+          </w:p>
+        </w:tc>
+        <w:tc>
+          <w:tcPr>
+            <w:tcW w:type="dxa" w:w="3118"/>
+          </w:tcPr>
+          <w:p>
+            <w:pPr>
+              <w:jc w:val="center"/>
+            </w:pPr>
+            <w:r>
+              <w:rPr>
+                <w:rFonts w:ascii="Times New Roman" w:hAnsi="Times New Roman"/>
+                <w:b/>
+                <w:sz w:val="20"/>
+              </w:rPr>
+              <w:t>Фамилия И.О.</w:t>
+            </w:r>
+          </w:p>
+        </w:tc>
+        <w:tc>
+          <w:tcPr>
+            <w:tcW w:type="dxa" w:w="1701"/>
+          </w:tcPr>
+          <w:p>
+            <w:pPr>
+              <w:jc w:val="center"/>
+            </w:pPr>
+            <w:r>
+              <w:rPr>
+                <w:rFonts w:ascii="Times New Roman" w:hAnsi="Times New Roman"/>
+                <w:b/>
+                <w:sz w:val="20"/>
+              </w:rPr>
+              <w:t>Подпись</w:t>
             </w:r>
           </w:p>
         </w:tc>
@@ -255,9 +3356,10 @@
             <w:r>
               <w:rPr>
                 <w:rFonts w:ascii="Times New Roman" w:hAnsi="Times New Roman"/>
+                <w:b/>
                 <w:sz w:val="20"/>
               </w:rPr>
-              <w:t>1</w:t>
+              <w:t>Дата</w:t>
             </w:r>
           </w:p>
         </w:tc>
@@ -265,24 +3367,7 @@
       <w:tr>
         <w:tc>
           <w:tcPr>
-            <w:tcW w:type="dxa" w:w="567"/>
-          </w:tcPr>
-          <w:p>
-            <w:pPr>
-              <w:jc w:val="center"/>
-            </w:pPr>
-            <w:r>
-              <w:rPr>
-                <w:rFonts w:ascii="Times New Roman" w:hAnsi="Times New Roman"/>
-                <w:sz w:val="20"/>
-              </w:rPr>
-              <w:t>2</w:t>
-            </w:r>
-          </w:p>
-        </w:tc>
-        <w:tc>
-          <w:tcPr>
-            <w:tcW w:type="dxa" w:w="5669"/>
+            <w:tcW w:type="dxa" w:w="3784"/>
           </w:tcPr>
           <w:p>
             <w:pPr>
@@ -291,15 +3376,16 @@
             <w:r>
               <w:rPr>
                 <w:rFonts w:ascii="Times New Roman" w:hAnsi="Times New Roman"/>
+                <w:b w:val="0"/>
                 <w:sz w:val="20"/>
               </w:rPr>
-              <w:t>Проверка соответствия выполненного монтажа проектной документации</w:t>
+              <w:t>Разработал</w:t>
             </w:r>
           </w:p>
         </w:tc>
         <w:tc>
           <w:tcPr>
-            <w:tcW w:type="dxa" w:w="1984"/>
+            <w:tcW w:type="dxa" w:w="3784"/>
           </w:tcPr>
           <w:p>
             <w:pPr>
@@ -308,85 +3394,30 @@
             <w:r>
               <w:rPr>
                 <w:rFonts w:ascii="Times New Roman" w:hAnsi="Times New Roman"/>
+                <w:b w:val="0"/>
                 <w:sz w:val="20"/>
               </w:rPr>
-              <w:t>РД 34.20.501</w:t>
+              <w:t>Иванов И.И.</w:t>
             </w:r>
           </w:p>
         </w:tc>
         <w:tc>
           <w:tcPr>
-            <w:tcW w:type="dxa" w:w="1020"/>
+            <w:tcW w:type="dxa" w:w="3784"/>
           </w:tcPr>
-          <w:p>
-            <w:pPr>
-              <w:jc w:val="center"/>
-            </w:pPr>
-            <w:r>
-              <w:rPr>
-                <w:rFonts w:ascii="Times New Roman" w:hAnsi="Times New Roman"/>
-                <w:sz w:val="20"/>
-              </w:rPr>
-              <w:t>компл.</w:t>
-            </w:r>
-          </w:p>
+          <w:p/>
         </w:tc>
         <w:tc>
           <w:tcPr>
-            <w:tcW w:type="dxa" w:w="1020"/>
+            <w:tcW w:type="dxa" w:w="3784"/>
           </w:tcPr>
-          <w:p>
-            <w:pPr>
-              <w:jc w:val="center"/>
-            </w:pPr>
-            <w:r>
-              <w:rPr>
-                <w:rFonts w:ascii="Times New Roman" w:hAnsi="Times New Roman"/>
-                <w:sz w:val="20"/>
-              </w:rPr>
-              <w:t>1</w:t>
-            </w:r>
-          </w:p>
-        </w:tc>
-        <w:tc>
-          <w:tcPr>
-            <w:tcW w:type="dxa" w:w="1417"/>
-          </w:tcPr>
-          <w:p>
-            <w:pPr>
-              <w:jc w:val="center"/>
-            </w:pPr>
-            <w:r>
-              <w:rPr>
-                <w:rFonts w:ascii="Times New Roman" w:hAnsi="Times New Roman"/>
-                <w:sz w:val="20"/>
-              </w:rPr>
-              <w:t>1</w:t>
-            </w:r>
-          </w:p>
+          <w:p/>
         </w:tc>
       </w:tr>
       <w:tr>
         <w:tc>
           <w:tcPr>
-            <w:tcW w:type="dxa" w:w="567"/>
-          </w:tcPr>
-          <w:p>
-            <w:pPr>
-              <w:jc w:val="center"/>
-            </w:pPr>
-            <w:r>
-              <w:rPr>
-                <w:rFonts w:ascii="Times New Roman" w:hAnsi="Times New Roman"/>
-                <w:sz w:val="20"/>
-              </w:rPr>
-              <w:t>3</w:t>
-            </w:r>
-          </w:p>
-        </w:tc>
-        <w:tc>
-          <w:tcPr>
-            <w:tcW w:type="dxa" w:w="5669"/>
+            <w:tcW w:type="dxa" w:w="3784"/>
           </w:tcPr>
           <w:p>
             <w:pPr>
@@ -395,15 +3426,16 @@
             <w:r>
               <w:rPr>
                 <w:rFonts w:ascii="Times New Roman" w:hAnsi="Times New Roman"/>
+                <w:b w:val="0"/>
                 <w:sz w:val="20"/>
               </w:rPr>
-              <w:t>Измерение сопротивления изоляции кабелей (Uиспыт=1000В)</w:t>
+              <w:t>Проверил</w:t>
             </w:r>
           </w:p>
         </w:tc>
         <w:tc>
           <w:tcPr>
-            <w:tcW w:type="dxa" w:w="1984"/>
+            <w:tcW w:type="dxa" w:w="3784"/>
           </w:tcPr>
           <w:p>
             <w:pPr>
@@ -412,85 +3444,30 @@
             <w:r>
               <w:rPr>
                 <w:rFonts w:ascii="Times New Roman" w:hAnsi="Times New Roman"/>
+                <w:b w:val="0"/>
                 <w:sz w:val="20"/>
               </w:rPr>
-              <w:t>ПУЭ 1.8.37</w:t>
+              <w:t>Петров П.П.</w:t>
             </w:r>
           </w:p>
         </w:tc>
         <w:tc>
           <w:tcPr>
-            <w:tcW w:type="dxa" w:w="1020"/>
+            <w:tcW w:type="dxa" w:w="3784"/>
           </w:tcPr>
-          <w:p>
-            <w:pPr>
-              <w:jc w:val="center"/>
-            </w:pPr>
-            <w:r>
-              <w:rPr>
-                <w:rFonts w:ascii="Times New Roman" w:hAnsi="Times New Roman"/>
-                <w:sz w:val="20"/>
-              </w:rPr>
-              <w:t>линия</w:t>
-            </w:r>
-          </w:p>
+          <w:p/>
         </w:tc>
         <w:tc>
           <w:tcPr>
-            <w:tcW w:type="dxa" w:w="1020"/>
+            <w:tcW w:type="dxa" w:w="3784"/>
           </w:tcPr>
-          <w:p>
-            <w:pPr>
-              <w:jc w:val="center"/>
-            </w:pPr>
-            <w:r>
-              <w:rPr>
-                <w:rFonts w:ascii="Times New Roman" w:hAnsi="Times New Roman"/>
-                <w:sz w:val="20"/>
-              </w:rPr>
-              <w:t>9</w:t>
-            </w:r>
-          </w:p>
-        </w:tc>
-        <w:tc>
-          <w:tcPr>
-            <w:tcW w:type="dxa" w:w="1417"/>
-          </w:tcPr>
-          <w:p>
-            <w:pPr>
-              <w:jc w:val="center"/>
-            </w:pPr>
-            <w:r>
-              <w:rPr>
-                <w:rFonts w:ascii="Times New Roman" w:hAnsi="Times New Roman"/>
-                <w:sz w:val="20"/>
-              </w:rPr>
-              <w:t>1</w:t>
-            </w:r>
-          </w:p>
+          <w:p/>
         </w:tc>
       </w:tr>
       <w:tr>
         <w:tc>
           <w:tcPr>
-            <w:tcW w:type="dxa" w:w="567"/>
-          </w:tcPr>
-          <w:p>
-            <w:pPr>
-              <w:jc w:val="center"/>
-            </w:pPr>
-            <w:r>
-              <w:rPr>
-                <w:rFonts w:ascii="Times New Roman" w:hAnsi="Times New Roman"/>
-                <w:sz w:val="20"/>
-              </w:rPr>
-              <w:t>4</w:t>
-            </w:r>
-          </w:p>
-        </w:tc>
-        <w:tc>
-          <w:tcPr>
-            <w:tcW w:type="dxa" w:w="5669"/>
+            <w:tcW w:type="dxa" w:w="3784"/>
           </w:tcPr>
           <w:p>
             <w:pPr>
@@ -499,15 +3476,16 @@
             <w:r>
               <w:rPr>
                 <w:rFonts w:ascii="Times New Roman" w:hAnsi="Times New Roman"/>
+                <w:b w:val="0"/>
                 <w:sz w:val="20"/>
               </w:rPr>
-              <w:t>Проверка правильности подключения фаз (чередование фаз)</w:t>
+              <w:t>Нормоконтроль</w:t>
             </w:r>
           </w:p>
         </w:tc>
         <w:tc>
           <w:tcPr>
-            <w:tcW w:type="dxa" w:w="1984"/>
+            <w:tcW w:type="dxa" w:w="3784"/>
           </w:tcPr>
           <w:p>
             <w:pPr>
@@ -516,85 +3494,30 @@
             <w:r>
               <w:rPr>
                 <w:rFonts w:ascii="Times New Roman" w:hAnsi="Times New Roman"/>
+                <w:b w:val="0"/>
                 <w:sz w:val="20"/>
               </w:rPr>
-              <w:t>ПУЭ 1.8.20</w:t>
+              <w:t>Сидоров С.С.</w:t>
             </w:r>
           </w:p>
         </w:tc>
         <w:tc>
           <w:tcPr>
-            <w:tcW w:type="dxa" w:w="1020"/>
+            <w:tcW w:type="dxa" w:w="3784"/>
           </w:tcPr>
-          <w:p>
-            <w:pPr>
-              <w:jc w:val="center"/>
-            </w:pPr>
-            <w:r>
-              <w:rPr>
-                <w:rFonts w:ascii="Times New Roman" w:hAnsi="Times New Roman"/>
-                <w:sz w:val="20"/>
-              </w:rPr>
-              <w:t>точка</w:t>
-            </w:r>
-          </w:p>
+          <w:p/>
         </w:tc>
         <w:tc>
           <w:tcPr>
-            <w:tcW w:type="dxa" w:w="1020"/>
+            <w:tcW w:type="dxa" w:w="3784"/>
           </w:tcPr>
-          <w:p>
-            <w:pPr>
-              <w:jc w:val="center"/>
-            </w:pPr>
-            <w:r>
-              <w:rPr>
-                <w:rFonts w:ascii="Times New Roman" w:hAnsi="Times New Roman"/>
-                <w:sz w:val="20"/>
-              </w:rPr>
-              <w:t>4</w:t>
-            </w:r>
-          </w:p>
-        </w:tc>
-        <w:tc>
-          <w:tcPr>
-            <w:tcW w:type="dxa" w:w="1417"/>
-          </w:tcPr>
-          <w:p>
-            <w:pPr>
-              <w:jc w:val="center"/>
-            </w:pPr>
-            <w:r>
-              <w:rPr>
-                <w:rFonts w:ascii="Times New Roman" w:hAnsi="Times New Roman"/>
-                <w:sz w:val="20"/>
-              </w:rPr>
-              <w:t>1</w:t>
-            </w:r>
-          </w:p>
+          <w:p/>
         </w:tc>
       </w:tr>
       <w:tr>
         <w:tc>
           <w:tcPr>
-            <w:tcW w:type="dxa" w:w="567"/>
-          </w:tcPr>
-          <w:p>
-            <w:pPr>
-              <w:jc w:val="center"/>
-            </w:pPr>
-            <w:r>
-              <w:rPr>
-                <w:rFonts w:ascii="Times New Roman" w:hAnsi="Times New Roman"/>
-                <w:sz w:val="20"/>
-              </w:rPr>
-              <w:t>5</w:t>
-            </w:r>
-          </w:p>
-        </w:tc>
-        <w:tc>
-          <w:tcPr>
-            <w:tcW w:type="dxa" w:w="5669"/>
+            <w:tcW w:type="dxa" w:w="3784"/>
           </w:tcPr>
           <w:p>
             <w:pPr>
@@ -603,15 +3526,16 @@
             <w:r>
               <w:rPr>
                 <w:rFonts w:ascii="Times New Roman" w:hAnsi="Times New Roman"/>
+                <w:b w:val="0"/>
                 <w:sz w:val="20"/>
               </w:rPr>
-              <w:t>Измерение сопротивления петли фаза-нуль</w:t>
+              <w:t>ГИП</w:t>
             </w:r>
           </w:p>
         </w:tc>
         <w:tc>
           <w:tcPr>
-            <w:tcW w:type="dxa" w:w="1984"/>
+            <w:tcW w:type="dxa" w:w="3784"/>
           </w:tcPr>
           <w:p>
             <w:pPr>
@@ -620,707 +3544,27 @@
             <w:r>
               <w:rPr>
                 <w:rFonts w:ascii="Times New Roman" w:hAnsi="Times New Roman"/>
+                <w:b w:val="0"/>
                 <w:sz w:val="20"/>
               </w:rPr>
-              <w:t>ПУЭ 1.8.36</w:t>
+              <w:t>Козлов К.К.</w:t>
             </w:r>
           </w:p>
         </w:tc>
         <w:tc>
           <w:tcPr>
-            <w:tcW w:type="dxa" w:w="1020"/>
+            <w:tcW w:type="dxa" w:w="3784"/>
           </w:tcPr>
-          <w:p>
-            <w:pPr>
-              <w:jc w:val="center"/>
-            </w:pPr>
-            <w:r>
-              <w:rPr>
-                <w:rFonts w:ascii="Times New Roman" w:hAnsi="Times New Roman"/>
-                <w:sz w:val="20"/>
-              </w:rPr>
-              <w:t>точка</w:t>
-            </w:r>
-          </w:p>
+          <w:p/>
         </w:tc>
         <w:tc>
           <w:tcPr>
-            <w:tcW w:type="dxa" w:w="1020"/>
+            <w:tcW w:type="dxa" w:w="3784"/>
           </w:tcPr>
-          <w:p>
-            <w:pPr>
-              <w:jc w:val="center"/>
-            </w:pPr>
-            <w:r>
-              <w:rPr>
-                <w:rFonts w:ascii="Times New Roman" w:hAnsi="Times New Roman"/>
-                <w:sz w:val="20"/>
-              </w:rPr>
-              <w:t>6</w:t>
-            </w:r>
-          </w:p>
-        </w:tc>
-        <w:tc>
-          <w:tcPr>
-            <w:tcW w:type="dxa" w:w="1417"/>
-          </w:tcPr>
-          <w:p>
-            <w:pPr>
-              <w:jc w:val="center"/>
-            </w:pPr>
-            <w:r>
-              <w:rPr>
-                <w:rFonts w:ascii="Times New Roman" w:hAnsi="Times New Roman"/>
-                <w:sz w:val="20"/>
-              </w:rPr>
-              <w:t>1</w:t>
-            </w:r>
-          </w:p>
-        </w:tc>
-      </w:tr>
-      <w:tr>
-        <w:tc>
-          <w:tcPr>
-            <w:tcW w:type="dxa" w:w="567"/>
-          </w:tcPr>
-          <w:p>
-            <w:pPr>
-              <w:jc w:val="center"/>
-            </w:pPr>
-            <w:r>
-              <w:rPr>
-                <w:rFonts w:ascii="Times New Roman" w:hAnsi="Times New Roman"/>
-                <w:sz w:val="20"/>
-              </w:rPr>
-              <w:t>6</w:t>
-            </w:r>
-          </w:p>
-        </w:tc>
-        <w:tc>
-          <w:tcPr>
-            <w:tcW w:type="dxa" w:w="5669"/>
-          </w:tcPr>
-          <w:p>
-            <w:pPr>
-              <w:jc w:val="left"/>
-            </w:pPr>
-            <w:r>
-              <w:rPr>
-                <w:rFonts w:ascii="Times New Roman" w:hAnsi="Times New Roman"/>
-                <w:sz w:val="20"/>
-              </w:rPr>
-              <w:t>Проверка срабатывания автоматических выключателей</w:t>
-            </w:r>
-          </w:p>
-        </w:tc>
-        <w:tc>
-          <w:tcPr>
-            <w:tcW w:type="dxa" w:w="1984"/>
-          </w:tcPr>
-          <w:p>
-            <w:pPr>
-              <w:jc w:val="left"/>
-            </w:pPr>
-            <w:r>
-              <w:rPr>
-                <w:rFonts w:ascii="Times New Roman" w:hAnsi="Times New Roman"/>
-                <w:sz w:val="20"/>
-              </w:rPr>
-              <w:t>ГОСТ Р 50345</w:t>
-            </w:r>
-          </w:p>
-        </w:tc>
-        <w:tc>
-          <w:tcPr>
-            <w:tcW w:type="dxa" w:w="1020"/>
-          </w:tcPr>
-          <w:p>
-            <w:pPr>
-              <w:jc w:val="center"/>
-            </w:pPr>
-            <w:r>
-              <w:rPr>
-                <w:rFonts w:ascii="Times New Roman" w:hAnsi="Times New Roman"/>
-                <w:sz w:val="20"/>
-              </w:rPr>
-              <w:t>шт.</w:t>
-            </w:r>
-          </w:p>
-        </w:tc>
-        <w:tc>
-          <w:tcPr>
-            <w:tcW w:type="dxa" w:w="1020"/>
-          </w:tcPr>
-          <w:p>
-            <w:pPr>
-              <w:jc w:val="center"/>
-            </w:pPr>
-            <w:r>
-              <w:rPr>
-                <w:rFonts w:ascii="Times New Roman" w:hAnsi="Times New Roman"/>
-                <w:sz w:val="20"/>
-              </w:rPr>
-              <w:t>10</w:t>
-            </w:r>
-          </w:p>
-        </w:tc>
-        <w:tc>
-          <w:tcPr>
-            <w:tcW w:type="dxa" w:w="1417"/>
-          </w:tcPr>
-          <w:p>
-            <w:pPr>
-              <w:jc w:val="center"/>
-            </w:pPr>
-            <w:r>
-              <w:rPr>
-                <w:rFonts w:ascii="Times New Roman" w:hAnsi="Times New Roman"/>
-                <w:sz w:val="20"/>
-              </w:rPr>
-              <w:t>1</w:t>
-            </w:r>
-          </w:p>
-        </w:tc>
-      </w:tr>
-      <w:tr>
-        <w:tc>
-          <w:tcPr>
-            <w:tcW w:type="dxa" w:w="567"/>
-          </w:tcPr>
-          <w:p>
-            <w:pPr>
-              <w:jc w:val="center"/>
-            </w:pPr>
-            <w:r>
-              <w:rPr>
-                <w:rFonts w:ascii="Times New Roman" w:hAnsi="Times New Roman"/>
-                <w:sz w:val="20"/>
-              </w:rPr>
-              <w:t>7</w:t>
-            </w:r>
-          </w:p>
-        </w:tc>
-        <w:tc>
-          <w:tcPr>
-            <w:tcW w:type="dxa" w:w="5669"/>
-          </w:tcPr>
-          <w:p>
-            <w:pPr>
-              <w:jc w:val="left"/>
-            </w:pPr>
-            <w:r>
-              <w:rPr>
-                <w:rFonts w:ascii="Times New Roman" w:hAnsi="Times New Roman"/>
-                <w:sz w:val="20"/>
-              </w:rPr>
-              <w:t>Проверка защитного заземления (Rзащ ≤ 0.1 Ом)</w:t>
-            </w:r>
-          </w:p>
-        </w:tc>
-        <w:tc>
-          <w:tcPr>
-            <w:tcW w:type="dxa" w:w="1984"/>
-          </w:tcPr>
-          <w:p>
-            <w:pPr>
-              <w:jc w:val="left"/>
-            </w:pPr>
-            <w:r>
-              <w:rPr>
-                <w:rFonts w:ascii="Times New Roman" w:hAnsi="Times New Roman"/>
-                <w:sz w:val="20"/>
-              </w:rPr>
-              <w:t>ПУЭ 1.8.39</w:t>
-            </w:r>
-          </w:p>
-        </w:tc>
-        <w:tc>
-          <w:tcPr>
-            <w:tcW w:type="dxa" w:w="1020"/>
-          </w:tcPr>
-          <w:p>
-            <w:pPr>
-              <w:jc w:val="center"/>
-            </w:pPr>
-            <w:r>
-              <w:rPr>
-                <w:rFonts w:ascii="Times New Roman" w:hAnsi="Times New Roman"/>
-                <w:sz w:val="20"/>
-              </w:rPr>
-              <w:t>точка</w:t>
-            </w:r>
-          </w:p>
-        </w:tc>
-        <w:tc>
-          <w:tcPr>
-            <w:tcW w:type="dxa" w:w="1020"/>
-          </w:tcPr>
-          <w:p>
-            <w:pPr>
-              <w:jc w:val="center"/>
-            </w:pPr>
-            <w:r>
-              <w:rPr>
-                <w:rFonts w:ascii="Times New Roman" w:hAnsi="Times New Roman"/>
-                <w:sz w:val="20"/>
-              </w:rPr>
-              <w:t>4</w:t>
-            </w:r>
-          </w:p>
-        </w:tc>
-        <w:tc>
-          <w:tcPr>
-            <w:tcW w:type="dxa" w:w="1417"/>
-          </w:tcPr>
-          <w:p>
-            <w:pPr>
-              <w:jc w:val="center"/>
-            </w:pPr>
-            <w:r>
-              <w:rPr>
-                <w:rFonts w:ascii="Times New Roman" w:hAnsi="Times New Roman"/>
-                <w:sz w:val="20"/>
-              </w:rPr>
-              <w:t>1</w:t>
-            </w:r>
-          </w:p>
-        </w:tc>
-      </w:tr>
-      <w:tr>
-        <w:tc>
-          <w:tcPr>
-            <w:tcW w:type="dxa" w:w="567"/>
-          </w:tcPr>
-          <w:p>
-            <w:pPr>
-              <w:jc w:val="center"/>
-            </w:pPr>
-            <w:r>
-              <w:rPr>
-                <w:rFonts w:ascii="Times New Roman" w:hAnsi="Times New Roman"/>
-                <w:sz w:val="20"/>
-              </w:rPr>
-              <w:t>8</w:t>
-            </w:r>
-          </w:p>
-        </w:tc>
-        <w:tc>
-          <w:tcPr>
-            <w:tcW w:type="dxa" w:w="5669"/>
-          </w:tcPr>
-          <w:p>
-            <w:pPr>
-              <w:jc w:val="left"/>
-            </w:pPr>
-            <w:r>
-              <w:rPr>
-                <w:rFonts w:ascii="Times New Roman" w:hAnsi="Times New Roman"/>
-                <w:sz w:val="20"/>
-              </w:rPr>
-              <w:t>Рабочее включение под нагрузку и проверка токов</w:t>
-            </w:r>
-          </w:p>
-        </w:tc>
-        <w:tc>
-          <w:tcPr>
-            <w:tcW w:type="dxa" w:w="1984"/>
-          </w:tcPr>
-          <w:p>
-            <w:pPr>
-              <w:jc w:val="left"/>
-            </w:pPr>
-            <w:r>
-              <w:rPr>
-                <w:rFonts w:ascii="Times New Roman" w:hAnsi="Times New Roman"/>
-                <w:sz w:val="20"/>
-              </w:rPr>
-              <w:t>РД 34.20.501</w:t>
-            </w:r>
-          </w:p>
-        </w:tc>
-        <w:tc>
-          <w:tcPr>
-            <w:tcW w:type="dxa" w:w="1020"/>
-          </w:tcPr>
-          <w:p>
-            <w:pPr>
-              <w:jc w:val="center"/>
-            </w:pPr>
-            <w:r>
-              <w:rPr>
-                <w:rFonts w:ascii="Times New Roman" w:hAnsi="Times New Roman"/>
-                <w:sz w:val="20"/>
-              </w:rPr>
-              <w:t>компл.</w:t>
-            </w:r>
-          </w:p>
-        </w:tc>
-        <w:tc>
-          <w:tcPr>
-            <w:tcW w:type="dxa" w:w="1020"/>
-          </w:tcPr>
-          <w:p>
-            <w:pPr>
-              <w:jc w:val="center"/>
-            </w:pPr>
-            <w:r>
-              <w:rPr>
-                <w:rFonts w:ascii="Times New Roman" w:hAnsi="Times New Roman"/>
-                <w:sz w:val="20"/>
-              </w:rPr>
-              <w:t>1</w:t>
-            </w:r>
-          </w:p>
-        </w:tc>
-        <w:tc>
-          <w:tcPr>
-            <w:tcW w:type="dxa" w:w="1417"/>
-          </w:tcPr>
-          <w:p>
-            <w:pPr>
-              <w:jc w:val="center"/>
-            </w:pPr>
-            <w:r>
-              <w:rPr>
-                <w:rFonts w:ascii="Times New Roman" w:hAnsi="Times New Roman"/>
-                <w:sz w:val="20"/>
-              </w:rPr>
-              <w:t>1</w:t>
-            </w:r>
-          </w:p>
-        </w:tc>
-      </w:tr>
-      <w:tr>
-        <w:tc>
-          <w:tcPr>
-            <w:tcW w:type="dxa" w:w="567"/>
-          </w:tcPr>
-          <w:p>
-            <w:pPr>
-              <w:jc w:val="center"/>
-            </w:pPr>
-            <w:r>
-              <w:rPr>
-                <w:rFonts w:ascii="Times New Roman" w:hAnsi="Times New Roman"/>
-                <w:sz w:val="20"/>
-              </w:rPr>
-              <w:t>9</w:t>
-            </w:r>
-          </w:p>
-        </w:tc>
-        <w:tc>
-          <w:tcPr>
-            <w:tcW w:type="dxa" w:w="5669"/>
-          </w:tcPr>
-          <w:p>
-            <w:pPr>
-              <w:jc w:val="left"/>
-            </w:pPr>
-            <w:r>
-              <w:rPr>
-                <w:rFonts w:ascii="Times New Roman" w:hAnsi="Times New Roman"/>
-                <w:sz w:val="20"/>
-              </w:rPr>
-              <w:t>Наладка и регулировка уставок автоматов (при необходимости)</w:t>
-            </w:r>
-          </w:p>
-        </w:tc>
-        <w:tc>
-          <w:tcPr>
-            <w:tcW w:type="dxa" w:w="1984"/>
-          </w:tcPr>
-          <w:p>
-            <w:pPr>
-              <w:jc w:val="left"/>
-            </w:pPr>
-            <w:r>
-              <w:rPr>
-                <w:rFonts w:ascii="Times New Roman" w:hAnsi="Times New Roman"/>
-                <w:sz w:val="20"/>
-              </w:rPr>
-              <w:t>ГОСТ Р 50345</w:t>
-            </w:r>
-          </w:p>
-        </w:tc>
-        <w:tc>
-          <w:tcPr>
-            <w:tcW w:type="dxa" w:w="1020"/>
-          </w:tcPr>
-          <w:p>
-            <w:pPr>
-              <w:jc w:val="center"/>
-            </w:pPr>
-            <w:r>
-              <w:rPr>
-                <w:rFonts w:ascii="Times New Roman" w:hAnsi="Times New Roman"/>
-                <w:sz w:val="20"/>
-              </w:rPr>
-              <w:t>шт.</w:t>
-            </w:r>
-          </w:p>
-        </w:tc>
-        <w:tc>
-          <w:tcPr>
-            <w:tcW w:type="dxa" w:w="1020"/>
-          </w:tcPr>
-          <w:p>
-            <w:pPr>
-              <w:jc w:val="center"/>
-            </w:pPr>
-            <w:r>
-              <w:rPr>
-                <w:rFonts w:ascii="Times New Roman" w:hAnsi="Times New Roman"/>
-                <w:sz w:val="20"/>
-              </w:rPr>
-              <w:t>4</w:t>
-            </w:r>
-          </w:p>
-        </w:tc>
-        <w:tc>
-          <w:tcPr>
-            <w:tcW w:type="dxa" w:w="1417"/>
-          </w:tcPr>
-          <w:p>
-            <w:pPr>
-              <w:jc w:val="center"/>
-            </w:pPr>
-            <w:r>
-              <w:rPr>
-                <w:rFonts w:ascii="Times New Roman" w:hAnsi="Times New Roman"/>
-                <w:sz w:val="20"/>
-              </w:rPr>
-              <w:t>1</w:t>
-            </w:r>
-          </w:p>
-        </w:tc>
-      </w:tr>
-      <w:tr>
-        <w:tc>
-          <w:tcPr>
-            <w:tcW w:type="dxa" w:w="567"/>
-          </w:tcPr>
-          <w:p>
-            <w:pPr>
-              <w:jc w:val="center"/>
-            </w:pPr>
-            <w:r>
-              <w:rPr>
-                <w:rFonts w:ascii="Times New Roman" w:hAnsi="Times New Roman"/>
-                <w:sz w:val="20"/>
-              </w:rPr>
-              <w:t>10</w:t>
-            </w:r>
-          </w:p>
-        </w:tc>
-        <w:tc>
-          <w:tcPr>
-            <w:tcW w:type="dxa" w:w="5669"/>
-          </w:tcPr>
-          <w:p>
-            <w:pPr>
-              <w:jc w:val="left"/>
-            </w:pPr>
-            <w:r>
-              <w:rPr>
-                <w:rFonts w:ascii="Times New Roman" w:hAnsi="Times New Roman"/>
-                <w:sz w:val="20"/>
-              </w:rPr>
-              <w:t>Оформление протоколов испытаний и измерений</w:t>
-            </w:r>
-          </w:p>
-        </w:tc>
-        <w:tc>
-          <w:tcPr>
-            <w:tcW w:type="dxa" w:w="1984"/>
-          </w:tcPr>
-          <w:p>
-            <w:pPr>
-              <w:jc w:val="left"/>
-            </w:pPr>
-            <w:r>
-              <w:rPr>
-                <w:rFonts w:ascii="Times New Roman" w:hAnsi="Times New Roman"/>
-                <w:sz w:val="20"/>
-              </w:rPr>
-              <w:t>ГОСТ Р 50571</w:t>
-            </w:r>
-          </w:p>
-        </w:tc>
-        <w:tc>
-          <w:tcPr>
-            <w:tcW w:type="dxa" w:w="1020"/>
-          </w:tcPr>
-          <w:p>
-            <w:pPr>
-              <w:jc w:val="center"/>
-            </w:pPr>
-            <w:r>
-              <w:rPr>
-                <w:rFonts w:ascii="Times New Roman" w:hAnsi="Times New Roman"/>
-                <w:sz w:val="20"/>
-              </w:rPr>
-              <w:t>компл.</w:t>
-            </w:r>
-          </w:p>
-        </w:tc>
-        <w:tc>
-          <w:tcPr>
-            <w:tcW w:type="dxa" w:w="1020"/>
-          </w:tcPr>
-          <w:p>
-            <w:pPr>
-              <w:jc w:val="center"/>
-            </w:pPr>
-            <w:r>
-              <w:rPr>
-                <w:rFonts w:ascii="Times New Roman" w:hAnsi="Times New Roman"/>
-                <w:sz w:val="20"/>
-              </w:rPr>
-              <w:t>1</w:t>
-            </w:r>
-          </w:p>
-        </w:tc>
-        <w:tc>
-          <w:tcPr>
-            <w:tcW w:type="dxa" w:w="1417"/>
-          </w:tcPr>
-          <w:p>
-            <w:pPr>
-              <w:jc w:val="center"/>
-            </w:pPr>
-            <w:r>
-              <w:rPr>
-                <w:rFonts w:ascii="Times New Roman" w:hAnsi="Times New Roman"/>
-                <w:sz w:val="20"/>
-              </w:rPr>
-              <w:t>1</w:t>
-            </w:r>
-          </w:p>
-        </w:tc>
-      </w:tr>
-      <w:tr>
-        <w:tc>
-          <w:tcPr>
-            <w:tcW w:type="dxa" w:w="567"/>
-          </w:tcPr>
-          <w:p>
-            <w:pPr>
-              <w:jc w:val="center"/>
-            </w:pPr>
-            <w:r>
-              <w:rPr>
-                <w:rFonts w:ascii="Times New Roman" w:hAnsi="Times New Roman"/>
-                <w:sz w:val="20"/>
-              </w:rPr>
-              <w:t>11</w:t>
-            </w:r>
-          </w:p>
-        </w:tc>
-        <w:tc>
-          <w:tcPr>
-            <w:tcW w:type="dxa" w:w="5669"/>
-          </w:tcPr>
-          <w:p>
-            <w:pPr>
-              <w:jc w:val="left"/>
-            </w:pPr>
-            <w:r>
-              <w:rPr>
-                <w:rFonts w:ascii="Times New Roman" w:hAnsi="Times New Roman"/>
-                <w:sz w:val="20"/>
-              </w:rPr>
-              <w:t>Оформление акта технической готовности</w:t>
-            </w:r>
-          </w:p>
-        </w:tc>
-        <w:tc>
-          <w:tcPr>
-            <w:tcW w:type="dxa" w:w="1984"/>
-          </w:tcPr>
-          <w:p>
-            <w:pPr>
-              <w:jc w:val="left"/>
-            </w:pPr>
-            <w:r>
-              <w:rPr>
-                <w:rFonts w:ascii="Times New Roman" w:hAnsi="Times New Roman"/>
-                <w:sz w:val="20"/>
-              </w:rPr>
-              <w:t>РД 34.20.501</w:t>
-            </w:r>
-          </w:p>
-        </w:tc>
-        <w:tc>
-          <w:tcPr>
-            <w:tcW w:type="dxa" w:w="1020"/>
-          </w:tcPr>
-          <w:p>
-            <w:pPr>
-              <w:jc w:val="center"/>
-            </w:pPr>
-            <w:r>
-              <w:rPr>
-                <w:rFonts w:ascii="Times New Roman" w:hAnsi="Times New Roman"/>
-                <w:sz w:val="20"/>
-              </w:rPr>
-              <w:t>акт</w:t>
-            </w:r>
-          </w:p>
-        </w:tc>
-        <w:tc>
-          <w:tcPr>
-            <w:tcW w:type="dxa" w:w="1020"/>
-          </w:tcPr>
-          <w:p>
-            <w:pPr>
-              <w:jc w:val="center"/>
-            </w:pPr>
-            <w:r>
-              <w:rPr>
-                <w:rFonts w:ascii="Times New Roman" w:hAnsi="Times New Roman"/>
-                <w:sz w:val="20"/>
-              </w:rPr>
-              <w:t>1</w:t>
-            </w:r>
-          </w:p>
-        </w:tc>
-        <w:tc>
-          <w:tcPr>
-            <w:tcW w:type="dxa" w:w="1417"/>
-          </w:tcPr>
-          <w:p>
-            <w:pPr>
-              <w:jc w:val="center"/>
-            </w:pPr>
-            <w:r>
-              <w:rPr>
-                <w:rFonts w:ascii="Times New Roman" w:hAnsi="Times New Roman"/>
-                <w:sz w:val="20"/>
-              </w:rPr>
-              <w:t>1</w:t>
-            </w:r>
-          </w:p>
+          <w:p/>
         </w:tc>
       </w:tr>
     </w:tbl>
-    <w:p/>
-    <w:p>
-      <w:r>
-        <w:rPr>
-          <w:rFonts w:ascii="Times New Roman" w:hAnsi="Times New Roman"/>
-          <w:sz w:val="20"/>
-        </w:rPr>
-        <w:t>Разработал: Иванов И.И.</w:t>
-        <w:tab/>
-        <w:tab/>
-        <w:tab/>
-        <w:t>Проверил: Петров П.П.</w:t>
-        <w:tab/>
-        <w:tab/>
-        <w:tab/>
-        <w:t>Согласовано: _______________</w:t>
-      </w:r>
-    </w:p>
     <w:sectPr>
       <w:pgSz w:w="16838" w:h="11906"/>
       <w:pgMar w:top="850" w:right="567" w:bottom="850" w:left="1134" w:header="720" w:footer="720" w:gutter="0"/>

</xml_diff>